<commit_message>
Spec: correct timetable/live-class ownership (admin schedules, tutor uploads link)
§10, §2.12, §2.13, §16 now match the built model: admin schedules the timetable
and generates the Meet link; the tutor only uploads it and sets live/ended;
students & tutors view the timetable read-only.
</commit_message>
<xml_diff>
--- a/docs/DSA-LMS-Backend-Spec.docx
+++ b/docs/DSA-LMS-Backend-Spec.docx
@@ -13533,7 +13533,17 @@
         <w:spacing w:after="100"/>
       </w:pPr>
       <w:r>
-        <w:t xml:space="preserve">Per track (and WAEC department). Either a grid blob or rows:</w:t>
+        <w:t xml:space="preserve">Per track (and WAEC department). </w:t>
+      </w:r>
+      <w:r>
+        <w:rPr>
+          <w:b/>
+          <w:bCs/>
+        </w:rPr>
+        <w:t xml:space="preserve">Admin-scheduled</w:t>
+      </w:r>
+      <w:r>
+        <w:t xml:space="preserve"> (tutors/students read-only).</w:t>
       </w:r>
     </w:p>
     <w:p>
@@ -13541,10 +13551,18 @@
         <w:spacing w:after="100"/>
       </w:pPr>
       <w:r>
+        <w:t xml:space="preserve">Either a grid blob or rows:</w:t>
+      </w:r>
+    </w:p>
+    <w:p>
+      <w:pPr>
+        <w:spacing w:after="100"/>
+      </w:pPr>
+      <w:r>
         <w:rPr>
           <w:rFonts w:ascii="Consolas" w:cs="Consolas" w:eastAsia="Consolas" w:hAnsi="Consolas"/>
         </w:rPr>
-        <w:t xml:space="preserve">TimetableSlot { id, examTrack, department?, day (Mon–Sat), period (1–4), startTime, endTime, subject, tutorId?, mode: online|physical, venue?, meetLink?, updatedBy, updatedAt }</w:t>
+        <w:t xml:space="preserve">TimetableSlot { id, examTrack, department?, day (Mon–Sat), period (1–4), startTime, endTime, subject, tutorId?, mode: online|physical, venue?, updatedBy (admin), updatedAt }</w:t>
       </w:r>
     </w:p>
     <w:p>
@@ -14191,7 +14209,14 @@
           </w:tcPr>
           <w:p>
             <w:r>
-              <w:t xml:space="preserve">Google Meet</w:t>
+              <w:t xml:space="preserve">Google Meet — </w:t>
+            </w:r>
+            <w:r>
+              <w:rPr>
+                <w:b/>
+                <w:bCs/>
+              </w:rPr>
+              <w:t xml:space="preserve">admin-generated, tutor-uploaded</w:t>
             </w:r>
           </w:p>
         </w:tc>
@@ -14327,6 +14352,16 @@
                 <w:rFonts w:ascii="Consolas" w:cs="Consolas" w:eastAsia="Consolas" w:hAnsi="Consolas"/>
               </w:rPr>
               <w:t xml:space="preserve">ended</w:t>
+            </w:r>
+            <w:r>
+              <w:t xml:space="preserve"> — </w:t>
+            </w:r>
+            <w:r>
+              <w:rPr>
+                <w:b/>
+                <w:bCs/>
+              </w:rPr>
+              <w:t xml:space="preserve">set by the tutor</w:t>
             </w:r>
           </w:p>
         </w:tc>
@@ -18850,6 +18885,154 @@
         <w:t xml:space="preserve">10. Timetable &amp; live classes  *(spec'd — build)*</w:t>
       </w:r>
     </w:p>
+    <w:p>
+      <w:pPr>
+        <w:spacing w:after="100"/>
+        <w:ind w:left="360"/>
+      </w:pPr>
+      <w:r>
+        <w:rPr>
+          <w:b/>
+          <w:bCs/>
+          <w:i/>
+          <w:iCs/>
+          <w:color w:val="555555"/>
+        </w:rPr>
+        <w:t xml:space="preserve">Ownership (as built):</w:t>
+      </w:r>
+      <w:r>
+        <w:rPr>
+          <w:i/>
+          <w:iCs/>
+          <w:color w:val="555555"/>
+        </w:rPr>
+        <w:t xml:space="preserve"> the </w:t>
+      </w:r>
+      <w:r>
+        <w:rPr>
+          <w:b/>
+          <w:bCs/>
+          <w:i/>
+          <w:iCs/>
+          <w:color w:val="555555"/>
+        </w:rPr>
+        <w:t xml:space="preserve">ADMIN</w:t>
+      </w:r>
+      <w:r>
+        <w:rPr>
+          <w:i/>
+          <w:iCs/>
+          <w:color w:val="555555"/>
+        </w:rPr>
+        <w:t xml:space="preserve"> schedules the timetable and **generates</w:t>
+      </w:r>
+    </w:p>
+    <w:p>
+      <w:pPr>
+        <w:spacing w:after="100"/>
+        <w:ind w:left="360"/>
+      </w:pPr>
+      <w:r>
+        <w:rPr>
+          <w:i/>
+          <w:iCs/>
+          <w:color w:val="555555"/>
+        </w:rPr>
+        <w:t xml:space="preserve">the Google Meet link** (externally, in Google Meet), then passes it to the</w:t>
+      </w:r>
+    </w:p>
+    <w:p>
+      <w:pPr>
+        <w:spacing w:after="100"/>
+        <w:ind w:left="360"/>
+      </w:pPr>
+      <w:r>
+        <w:rPr>
+          <w:b/>
+          <w:bCs/>
+          <w:i/>
+          <w:iCs/>
+          <w:color w:val="555555"/>
+        </w:rPr>
+        <w:t xml:space="preserve">TUTOR</w:t>
+      </w:r>
+      <w:r>
+        <w:rPr>
+          <w:i/>
+          <w:iCs/>
+          <w:color w:val="555555"/>
+        </w:rPr>
+        <w:t xml:space="preserve">, who </w:t>
+      </w:r>
+      <w:r>
+        <w:rPr>
+          <w:b/>
+          <w:bCs/>
+          <w:i/>
+          <w:iCs/>
+          <w:color w:val="555555"/>
+        </w:rPr>
+        <w:t xml:space="preserve">uploads</w:t>
+      </w:r>
+      <w:r>
+        <w:rPr>
+          <w:i/>
+          <w:iCs/>
+          <w:color w:val="555555"/>
+        </w:rPr>
+        <w:t xml:space="preserve"> it and flips the class </w:t>
+      </w:r>
+      <w:r>
+        <w:rPr>
+          <w:b/>
+          <w:bCs/>
+          <w:i/>
+          <w:iCs/>
+          <w:color w:val="555555"/>
+        </w:rPr>
+        <w:t xml:space="preserve">live/ended</w:t>
+      </w:r>
+      <w:r>
+        <w:rPr>
+          <w:i/>
+          <w:iCs/>
+          <w:color w:val="555555"/>
+        </w:rPr>
+        <w:t xml:space="preserve">. Students and</w:t>
+      </w:r>
+    </w:p>
+    <w:p>
+      <w:pPr>
+        <w:spacing w:after="100"/>
+        <w:ind w:left="360"/>
+      </w:pPr>
+      <w:r>
+        <w:rPr>
+          <w:i/>
+          <w:iCs/>
+          <w:color w:val="555555"/>
+        </w:rPr>
+        <w:t xml:space="preserve">tutors view the timetable </w:t>
+      </w:r>
+      <w:r>
+        <w:rPr>
+          <w:b/>
+          <w:bCs/>
+          <w:i/>
+          <w:iCs/>
+          <w:color w:val="555555"/>
+        </w:rPr>
+        <w:t xml:space="preserve">read-only</w:t>
+      </w:r>
+      <w:r>
+        <w:rPr>
+          <w:i/>
+          <w:iCs/>
+          <w:color w:val="555555"/>
+        </w:rPr>
+        <w:t xml:space="preserve">; students join when the tutor is live.</w:t>
+      </w:r>
+    </w:p>
     <w:tbl>
       <w:tblPr>
         <w:tblW w:type="dxa" w:w="9360"/>
@@ -19024,7 +19207,7 @@
           </w:tcPr>
           <w:p>
             <w:r>
-              <w:t xml:space="preserve">grid (student view)</w:t>
+              <w:t xml:space="preserve">grid — students &amp; tutors view (read-only)</w:t>
             </w:r>
           </w:p>
         </w:tc>
@@ -19080,23 +19263,27 @@
           </w:tcPr>
           <w:p>
             <w:r>
-              <w:t xml:space="preserve">tutor/admin</w:t>
-            </w:r>
-          </w:p>
-        </w:tc>
-        <w:tc>
-          <w:tcPr>
-            <w:tcW w:type="dxa" w:w="2340"/>
-            <w:tcMar>
-              <w:top w:type="dxa" w:w="40"/>
-              <w:left w:type="dxa" w:w="80"/>
-              <w:bottom w:type="dxa" w:w="40"/>
-              <w:right w:type="dxa" w:w="80"/>
-            </w:tcMar>
-          </w:tcPr>
-          <w:p>
-            <w:r>
-              <w:t xml:space="preserve">edit grid</w:t>
+              <w:rPr>
+                <w:b/>
+                <w:bCs/>
+              </w:rPr>
+              <w:t xml:space="preserve">admin only</w:t>
+            </w:r>
+          </w:p>
+        </w:tc>
+        <w:tc>
+          <w:tcPr>
+            <w:tcW w:type="dxa" w:w="2340"/>
+            <w:tcMar>
+              <w:top w:type="dxa" w:w="40"/>
+              <w:left w:type="dxa" w:w="80"/>
+              <w:bottom w:type="dxa" w:w="40"/>
+              <w:right w:type="dxa" w:w="80"/>
+            </w:tcMar>
+          </w:tcPr>
+          <w:p>
+            <w:r>
+              <w:t xml:space="preserve">schedule/edit the grid</w:t>
             </w:r>
           </w:p>
         </w:tc>
@@ -19152,23 +19339,23 @@
           </w:tcPr>
           <w:p>
             <w:r>
-              <w:t xml:space="preserve">enrolled</w:t>
-            </w:r>
-          </w:p>
-        </w:tc>
-        <w:tc>
-          <w:tcPr>
-            <w:tcW w:type="dxa" w:w="2340"/>
-            <w:tcMar>
-              <w:top w:type="dxa" w:w="40"/>
-              <w:left w:type="dxa" w:w="80"/>
-              <w:bottom w:type="dxa" w:w="40"/>
-              <w:right w:type="dxa" w:w="80"/>
-            </w:tcMar>
-          </w:tcPr>
-          <w:p>
-            <w:r>
-              <w:t xml:space="preserve">upcoming/live</w:t>
+              <w:t xml:space="preserve">enrolled/tutor</w:t>
+            </w:r>
+          </w:p>
+        </w:tc>
+        <w:tc>
+          <w:tcPr>
+            <w:tcW w:type="dxa" w:w="2340"/>
+            <w:tcMar>
+              <w:top w:type="dxa" w:w="40"/>
+              <w:left w:type="dxa" w:w="80"/>
+              <w:bottom w:type="dxa" w:w="40"/>
+              <w:right w:type="dxa" w:w="80"/>
+            </w:tcMar>
+          </w:tcPr>
+          <w:p>
+            <w:r>
+              <w:t xml:space="preserve">upcoming/live for the track</w:t>
             </w:r>
           </w:p>
         </w:tc>
@@ -19189,26 +19376,26 @@
           </w:tcPr>
           <w:p>
             <w:r>
-              <w:t xml:space="preserve">POST</w:t>
-            </w:r>
-          </w:p>
-        </w:tc>
-        <w:tc>
-          <w:tcPr>
-            <w:tcW w:type="dxa" w:w="2340"/>
-            <w:tcMar>
-              <w:top w:type="dxa" w:w="40"/>
-              <w:left w:type="dxa" w:w="80"/>
-              <w:bottom w:type="dxa" w:w="40"/>
-              <w:right w:type="dxa" w:w="80"/>
-            </w:tcMar>
-          </w:tcPr>
-          <w:p>
-            <w:r>
-              <w:rPr>
-                <w:rFonts w:ascii="Consolas" w:cs="Consolas" w:eastAsia="Consolas" w:hAnsi="Consolas"/>
-              </w:rPr>
-              <w:t xml:space="preserve">/live-classes</w:t>
+              <w:t xml:space="preserve">PUT</w:t>
+            </w:r>
+          </w:p>
+        </w:tc>
+        <w:tc>
+          <w:tcPr>
+            <w:tcW w:type="dxa" w:w="2340"/>
+            <w:tcMar>
+              <w:top w:type="dxa" w:w="40"/>
+              <w:left w:type="dxa" w:w="80"/>
+              <w:bottom w:type="dxa" w:w="40"/>
+              <w:right w:type="dxa" w:w="80"/>
+            </w:tcMar>
+          </w:tcPr>
+          <w:p>
+            <w:r>
+              <w:rPr>
+                <w:rFonts w:ascii="Consolas" w:cs="Consolas" w:eastAsia="Consolas" w:hAnsi="Consolas"/>
+              </w:rPr>
+              <w:t xml:space="preserve">/live-classes/:track/link</w:t>
             </w:r>
           </w:p>
         </w:tc>
@@ -19240,16 +19427,11 @@
           </w:tcPr>
           <w:p>
             <w:r>
-              <w:t xml:space="preserve">schedule (sets </w:t>
-            </w:r>
-            <w:r>
-              <w:rPr>
-                <w:rFonts w:ascii="Consolas" w:cs="Consolas" w:eastAsia="Consolas" w:hAnsi="Consolas"/>
-              </w:rPr>
-              <w:t xml:space="preserve">meetLink</w:t>
-            </w:r>
-            <w:r>
-              <w:t xml:space="preserve">)</w:t>
+              <w:rPr>
+                <w:b/>
+                <w:bCs/>
+              </w:rPr>
+              <w:t xml:space="preserve">upload the admin-generated Meet link</w:t>
             </w:r>
           </w:p>
         </w:tc>
@@ -19289,7 +19471,7 @@
               <w:rPr>
                 <w:rFonts w:ascii="Consolas" w:cs="Consolas" w:eastAsia="Consolas" w:hAnsi="Consolas"/>
               </w:rPr>
-              <w:t xml:space="preserve">/live-classes/:id/status</w:t>
+              <w:t xml:space="preserve">/live-classes/:track/status</w:t>
             </w:r>
           </w:p>
         </w:tc>
@@ -19321,7 +19503,34 @@
           </w:tcPr>
           <w:p>
             <w:r>
-              <w:t xml:space="preserve">live/ended (+recordingUrl)</w:t>
+              <w:t xml:space="preserve">set </w:t>
+            </w:r>
+            <w:r>
+              <w:rPr>
+                <w:rFonts w:ascii="Consolas" w:cs="Consolas" w:eastAsia="Consolas" w:hAnsi="Consolas"/>
+              </w:rPr>
+              <w:t xml:space="preserve">live</w:t>
+            </w:r>
+            <w:r>
+              <w:t xml:space="preserve"> / </w:t>
+            </w:r>
+            <w:r>
+              <w:rPr>
+                <w:rFonts w:ascii="Consolas" w:cs="Consolas" w:eastAsia="Consolas" w:hAnsi="Consolas"/>
+              </w:rPr>
+              <w:t xml:space="preserve">ended</w:t>
+            </w:r>
+            <w:r>
+              <w:t xml:space="preserve"> (+</w:t>
+            </w:r>
+            <w:r>
+              <w:rPr>
+                <w:rFonts w:ascii="Consolas" w:cs="Consolas" w:eastAsia="Consolas" w:hAnsi="Consolas"/>
+              </w:rPr>
+              <w:t xml:space="preserve">recordingUrl</w:t>
+            </w:r>
+            <w:r>
+              <w:t xml:space="preserve">)</w:t>
             </w:r>
           </w:p>
         </w:tc>
@@ -19393,7 +19602,7 @@
           </w:tcPr>
           <w:p>
             <w:r>
-              <w:t xml:space="preserve">next class (drives "Join Live Class")</w:t>
+              <w:t xml:space="preserve">next class + join state (drives "Join Live Class")</w:t>
             </w:r>
           </w:p>
         </w:tc>
@@ -21114,6 +21323,57 @@
       <w:pPr>
         <w:spacing w:after="80"/>
       </w:pPr>
+    </w:p>
+    <w:p>
+      <w:pPr>
+        <w:spacing w:after="100"/>
+      </w:pPr>
+      <w:r>
+        <w:rPr>
+          <w:b/>
+          <w:bCs/>
+        </w:rPr>
+        <w:t xml:space="preserve">Timetable &amp; live classes:</w:t>
+      </w:r>
+      <w:r>
+        <w:t xml:space="preserve"> the </w:t>
+      </w:r>
+      <w:r>
+        <w:rPr>
+          <w:b/>
+          <w:bCs/>
+        </w:rPr>
+        <w:t xml:space="preserve">admin</w:t>
+      </w:r>
+      <w:r>
+        <w:t xml:space="preserve"> schedules the timetable and generates</w:t>
+      </w:r>
+    </w:p>
+    <w:p>
+      <w:pPr>
+        <w:spacing w:after="100"/>
+      </w:pPr>
+      <w:r>
+        <w:t xml:space="preserve">the Meet link; the </w:t>
+      </w:r>
+      <w:r>
+        <w:rPr>
+          <w:b/>
+          <w:bCs/>
+        </w:rPr>
+        <w:t xml:space="preserve">tutor</w:t>
+      </w:r>
+      <w:r>
+        <w:t xml:space="preserve"> only uploads that link and sets the class live/ended</w:t>
+      </w:r>
+    </w:p>
+    <w:p>
+      <w:pPr>
+        <w:spacing w:after="100"/>
+      </w:pPr>
+      <w:r>
+        <w:t xml:space="preserve">(tutors do NOT edit the timetable). Enforce this split server-side.</w:t>
+      </w:r>
     </w:p>
     <w:p>
       <w:pPr>

</xml_diff>

<commit_message>
Admin people management, remove seeded data, auth routing guards
- Admin: live Tutors & Guardians views (directoryStore + PeopleRoster); Create Tutor/Guardian now record into the directory; live Students roster and Admin home.
- Remove all seeded/demo people (students, tutors, guardians, staff); lists now show only real registrations/admin-created accounts. Keep secretary/auditor role templates for Create Staff.
- Auth routing/security: signin/verify-otp redirect with router.replace and signin/signup redirect an already-authenticated user to their dashboard (back button no longer lands an admin on an auth page).
- Backend spec: add GET /admin/users?role= list endpoint + admin management-views note; regenerate docx.
</commit_message>
<xml_diff>
--- a/docs/DSA-LMS-Backend-Spec.docx
+++ b/docs/DSA-LMS-Backend-Spec.docx
@@ -15722,11 +15722,347 @@
           </w:p>
         </w:tc>
       </w:tr>
+      <w:tr>
+        <w:trPr>
+          <w:tblHeader w:val="false"/>
+        </w:trPr>
+        <w:tc>
+          <w:tcPr>
+            <w:tcW w:type="dxa" w:w="2340"/>
+            <w:tcMar>
+              <w:top w:type="dxa" w:w="40"/>
+              <w:left w:type="dxa" w:w="80"/>
+              <w:bottom w:type="dxa" w:w="40"/>
+              <w:right w:type="dxa" w:w="80"/>
+            </w:tcMar>
+          </w:tcPr>
+          <w:p>
+            <w:r>
+              <w:t xml:space="preserve">GET</w:t>
+            </w:r>
+          </w:p>
+        </w:tc>
+        <w:tc>
+          <w:tcPr>
+            <w:tcW w:type="dxa" w:w="2340"/>
+            <w:tcMar>
+              <w:top w:type="dxa" w:w="40"/>
+              <w:left w:type="dxa" w:w="80"/>
+              <w:bottom w:type="dxa" w:w="40"/>
+              <w:right w:type="dxa" w:w="80"/>
+            </w:tcMar>
+          </w:tcPr>
+          <w:p>
+            <w:r>
+              <w:rPr>
+                <w:rFonts w:ascii="Consolas" w:cs="Consolas" w:eastAsia="Consolas" w:hAnsi="Consolas"/>
+              </w:rPr>
+              <w:t xml:space="preserve">/admin/users?role=…</w:t>
+            </w:r>
+          </w:p>
+        </w:tc>
+        <w:tc>
+          <w:tcPr>
+            <w:tcW w:type="dxa" w:w="2340"/>
+            <w:tcMar>
+              <w:top w:type="dxa" w:w="40"/>
+              <w:left w:type="dxa" w:w="80"/>
+              <w:bottom w:type="dxa" w:w="40"/>
+              <w:right w:type="dxa" w:w="80"/>
+            </w:tcMar>
+          </w:tcPr>
+          <w:p>
+            <w:r>
+              <w:t xml:space="preserve">admin</w:t>
+            </w:r>
+          </w:p>
+        </w:tc>
+        <w:tc>
+          <w:tcPr>
+            <w:tcW w:type="dxa" w:w="2340"/>
+            <w:tcMar>
+              <w:top w:type="dxa" w:w="40"/>
+              <w:left w:type="dxa" w:w="80"/>
+              <w:bottom w:type="dxa" w:w="40"/>
+              <w:right w:type="dxa" w:w="80"/>
+            </w:tcMar>
+          </w:tcPr>
+          <w:p>
+            <w:r>
+              <w:rPr>
+                <w:b/>
+                <w:bCs/>
+              </w:rPr>
+              <w:t xml:space="preserve">new</w:t>
+            </w:r>
+            <w:r>
+              <w:t xml:space="preserve"> — list users by role (</w:t>
+            </w:r>
+            <w:r>
+              <w:rPr>
+                <w:rFonts w:ascii="Consolas" w:cs="Consolas" w:eastAsia="Consolas" w:hAnsi="Consolas"/>
+              </w:rPr>
+              <w:t xml:space="preserve">student</w:t>
+            </w:r>
+            <w:r>
+              <w:t xml:space="preserve">/</w:t>
+            </w:r>
+            <w:r>
+              <w:rPr>
+                <w:rFonts w:ascii="Consolas" w:cs="Consolas" w:eastAsia="Consolas" w:hAnsi="Consolas"/>
+              </w:rPr>
+              <w:t xml:space="preserve">tutor</w:t>
+            </w:r>
+            <w:r>
+              <w:t xml:space="preserve">/</w:t>
+            </w:r>
+            <w:r>
+              <w:rPr>
+                <w:rFonts w:ascii="Consolas" w:cs="Consolas" w:eastAsia="Consolas" w:hAnsi="Consolas"/>
+              </w:rPr>
+              <w:t xml:space="preserve">parent</w:t>
+            </w:r>
+            <w:r>
+              <w:t xml:space="preserve">/</w:t>
+            </w:r>
+            <w:r>
+              <w:rPr>
+                <w:rFonts w:ascii="Consolas" w:cs="Consolas" w:eastAsia="Consolas" w:hAnsi="Consolas"/>
+              </w:rPr>
+              <w:t xml:space="preserve">staff</w:t>
+            </w:r>
+            <w:r>
+              <w:t xml:space="preserve">) for the admin's </w:t>
+            </w:r>
+            <w:r>
+              <w:rPr>
+                <w:b/>
+                <w:bCs/>
+              </w:rPr>
+              <w:t xml:space="preserve">Students / Tutors / Guardians / Staff</w:t>
+            </w:r>
+            <w:r>
+              <w:t xml:space="preserve"> management views. Supports </w:t>
+            </w:r>
+            <w:r>
+              <w:rPr>
+                <w:rFonts w:ascii="Consolas" w:cs="Consolas" w:eastAsia="Consolas" w:hAnsi="Consolas"/>
+              </w:rPr>
+              <w:t xml:space="preserve">?search=</w:t>
+            </w:r>
+            <w:r>
+              <w:t xml:space="preserve">&amp;pagination</w:t>
+            </w:r>
+          </w:p>
+        </w:tc>
+      </w:tr>
     </w:tbl>
     <w:p>
       <w:pPr>
         <w:spacing w:after="80"/>
       </w:pPr>
+    </w:p>
+    <w:p>
+      <w:pPr>
+        <w:spacing w:after="100"/>
+        <w:ind w:left="360"/>
+      </w:pPr>
+      <w:r>
+        <w:rPr>
+          <w:b/>
+          <w:bCs/>
+          <w:i/>
+          <w:iCs/>
+          <w:color w:val="555555"/>
+        </w:rPr>
+        <w:t xml:space="preserve">Admin management views (as built).</w:t>
+      </w:r>
+      <w:r>
+        <w:rPr>
+          <w:i/>
+          <w:iCs/>
+          <w:color w:val="555555"/>
+        </w:rPr>
+        <w:t xml:space="preserve"> The admin dashboard has live lists for</w:t>
+      </w:r>
+    </w:p>
+    <w:p>
+      <w:pPr>
+        <w:spacing w:after="100"/>
+        <w:ind w:left="360"/>
+      </w:pPr>
+      <w:r>
+        <w:rPr>
+          <w:b/>
+          <w:bCs/>
+          <w:i/>
+          <w:iCs/>
+          <w:color w:val="555555"/>
+        </w:rPr>
+        <w:t xml:space="preserve">Students, Tutors, Guardians</w:t>
+      </w:r>
+      <w:r>
+        <w:rPr>
+          <w:i/>
+          <w:iCs/>
+          <w:color w:val="555555"/>
+        </w:rPr>
+        <w:t xml:space="preserve"> (and Staff under Permissions). Right now the</w:t>
+      </w:r>
+    </w:p>
+    <w:p>
+      <w:pPr>
+        <w:spacing w:after="100"/>
+        <w:ind w:left="360"/>
+      </w:pPr>
+      <w:r>
+        <w:rPr>
+          <w:i/>
+          <w:iCs/>
+          <w:color w:val="555555"/>
+        </w:rPr>
+        <w:t xml:space="preserve">frontend records admin-created </w:t>
+      </w:r>
+      <w:r>
+        <w:rPr>
+          <w:b/>
+          <w:bCs/>
+          <w:i/>
+          <w:iCs/>
+          <w:color w:val="555555"/>
+        </w:rPr>
+        <w:t xml:space="preserve">tutors/guardians locally</w:t>
+      </w:r>
+      <w:r>
+        <w:rPr>
+          <w:i/>
+          <w:iCs/>
+          <w:color w:val="555555"/>
+        </w:rPr>
+        <w:t xml:space="preserve"> (and lists locally</w:t>
+      </w:r>
+    </w:p>
+    <w:p>
+      <w:pPr>
+        <w:spacing w:after="100"/>
+        <w:ind w:left="360"/>
+      </w:pPr>
+      <w:r>
+        <w:rPr>
+          <w:i/>
+          <w:iCs/>
+          <w:color w:val="555555"/>
+        </w:rPr>
+        <w:t xml:space="preserve">registered students) because there is no list endpoint yet — it swaps to</w:t>
+      </w:r>
+    </w:p>
+    <w:p>
+      <w:pPr>
+        <w:spacing w:after="100"/>
+        <w:ind w:left="360"/>
+      </w:pPr>
+      <w:r>
+        <w:rPr>
+          <w:rFonts w:ascii="Consolas" w:cs="Consolas" w:eastAsia="Consolas" w:hAnsi="Consolas"/>
+          <w:i/>
+          <w:iCs/>
+          <w:color w:val="555555"/>
+        </w:rPr>
+        <w:t xml:space="preserve">GET /admin/users?role=…</w:t>
+      </w:r>
+      <w:r>
+        <w:rPr>
+          <w:i/>
+          <w:iCs/>
+          <w:color w:val="555555"/>
+        </w:rPr>
+        <w:t xml:space="preserve"> the moment it exists. No demo/seed people remain in</w:t>
+      </w:r>
+    </w:p>
+    <w:p>
+      <w:pPr>
+        <w:spacing w:after="100"/>
+        <w:ind w:left="360"/>
+      </w:pPr>
+      <w:r>
+        <w:rPr>
+          <w:i/>
+          <w:iCs/>
+          <w:color w:val="555555"/>
+        </w:rPr>
+        <w:t xml:space="preserve">the UI: every list is driven by real registrations / admin-created accounts.</w:t>
+      </w:r>
+    </w:p>
+    <w:p>
+      <w:pPr>
+        <w:spacing w:after="100"/>
+        <w:ind w:left="360"/>
+      </w:pPr>
+      <w:r>
+        <w:rPr>
+          <w:i/>
+          <w:iCs/>
+          <w:color w:val="555555"/>
+        </w:rPr>
+        <w:t xml:space="preserve">Note tutors &amp; guardians are still created via </w:t>
+      </w:r>
+      <w:r>
+        <w:rPr>
+          <w:rFonts w:ascii="Consolas" w:cs="Consolas" w:eastAsia="Consolas" w:hAnsi="Consolas"/>
+          <w:i/>
+          <w:iCs/>
+          <w:color w:val="555555"/>
+        </w:rPr>
+        <w:t xml:space="preserve">/auth/register</w:t>
+      </w:r>
+      <w:r>
+        <w:rPr>
+          <w:i/>
+          <w:iCs/>
+          <w:color w:val="555555"/>
+        </w:rPr>
+        <w:t xml:space="preserve"> (role </w:t>
+      </w:r>
+      <w:r>
+        <w:rPr>
+          <w:rFonts w:ascii="Consolas" w:cs="Consolas" w:eastAsia="Consolas" w:hAnsi="Consolas"/>
+          <w:i/>
+          <w:iCs/>
+          <w:color w:val="555555"/>
+        </w:rPr>
+        <w:t xml:space="preserve">tutor</w:t>
+      </w:r>
+      <w:r>
+        <w:rPr>
+          <w:i/>
+          <w:iCs/>
+          <w:color w:val="555555"/>
+        </w:rPr>
+        <w:t xml:space="preserve"> /</w:t>
+      </w:r>
+    </w:p>
+    <w:p>
+      <w:pPr>
+        <w:spacing w:after="100"/>
+        <w:ind w:left="360"/>
+      </w:pPr>
+      <w:r>
+        <w:rPr>
+          <w:rFonts w:ascii="Consolas" w:cs="Consolas" w:eastAsia="Consolas" w:hAnsi="Consolas"/>
+          <w:i/>
+          <w:iCs/>
+          <w:color w:val="555555"/>
+        </w:rPr>
+        <w:t xml:space="preserve">parent</w:t>
+      </w:r>
+      <w:r>
+        <w:rPr>
+          <w:i/>
+          <w:iCs/>
+          <w:color w:val="555555"/>
+        </w:rPr>
+        <w:t xml:space="preserve">); a dedicated admin-create endpoint is requested above.</w:t>
+      </w:r>
     </w:p>
     <w:p>
       <w:pPr>

</xml_diff>

<commit_message>
Course catalog: categories, tutor assignment, student/tutor visibility
- Courses grouped into categories: waec-sss (WAEC+SS1-3), jamb-putme (JAMB & Post-UTME share courses), higher (100/200). getCourses(track) now filters by category.
- Admin Course Manager: add courses per category and assign a tutor; new admin nav + home action.
- Student My Courses view: their category's courses + assigned tutors.
- Tutor My Students now filtered to students doing the tutor's courses (category match).
- Backend spec: Course.category + tutorId, /courses/mine, /tutors/me/students, admin-assigns-tutor; regenerate docx.
</commit_message>
<xml_diff>
--- a/docs/DSA-LMS-Backend-Spec.docx
+++ b/docs/DSA-LMS-Backend-Spec.docx
@@ -4217,7 +4217,17 @@
         <w:spacing w:after="100"/>
       </w:pPr>
       <w:r>
-        <w:t xml:space="preserve">A teachable unit (e.g. "JAMB Mathematics", "WAEC Physics").</w:t>
+        <w:t xml:space="preserve">A teachable unit, grouped into a </w:t>
+      </w:r>
+      <w:r>
+        <w:rPr>
+          <w:b/>
+          <w:bCs/>
+        </w:rPr>
+        <w:t xml:space="preserve">category</w:t>
+      </w:r>
+      <w:r>
+        <w:t xml:space="preserve"> shared across tracks/levels.</w:t>
       </w:r>
     </w:p>
     <w:tbl>
@@ -4233,11 +4243,9 @@
         </w:tblBorders>
       </w:tblPr>
       <w:tblGrid>
-        <w:gridCol w:w="1872"/>
-        <w:gridCol w:w="1872"/>
-        <w:gridCol w:w="1872"/>
-        <w:gridCol w:w="1872"/>
-        <w:gridCol w:w="1872"/>
+        <w:gridCol w:w="3120"/>
+        <w:gridCol w:w="3120"/>
+        <w:gridCol w:w="3120"/>
       </w:tblGrid>
       <w:tr>
         <w:trPr>
@@ -4245,7 +4253,7 @@
         </w:trPr>
         <w:tc>
           <w:tcPr>
-            <w:tcW w:type="dxa" w:w="1872"/>
+            <w:tcW w:type="dxa" w:w="3120"/>
             <w:shd w:fill="E8ECF7" w:val="clear"/>
             <w:tcMar>
               <w:top w:type="dxa" w:w="40"/>
@@ -4266,7 +4274,7 @@
         </w:tc>
         <w:tc>
           <w:tcPr>
-            <w:tcW w:type="dxa" w:w="1872"/>
+            <w:tcW w:type="dxa" w:w="3120"/>
             <w:shd w:fill="E8ECF7" w:val="clear"/>
             <w:tcMar>
               <w:top w:type="dxa" w:w="40"/>
@@ -4287,7 +4295,7 @@
         </w:tc>
         <w:tc>
           <w:tcPr>
-            <w:tcW w:type="dxa" w:w="1872"/>
+            <w:tcW w:type="dxa" w:w="3120"/>
             <w:shd w:fill="E8ECF7" w:val="clear"/>
             <w:tcMar>
               <w:top w:type="dxa" w:w="40"/>
@@ -4303,48 +4311,6 @@
                 <w:bCs/>
               </w:rPr>
               <w:t xml:space="preserve">Notes</w:t>
-            </w:r>
-          </w:p>
-        </w:tc>
-        <w:tc>
-          <w:tcPr>
-            <w:tcW w:type="dxa" w:w="1872"/>
-            <w:shd w:fill="E8ECF7" w:val="clear"/>
-            <w:tcMar>
-              <w:top w:type="dxa" w:w="40"/>
-              <w:left w:type="dxa" w:w="80"/>
-              <w:bottom w:type="dxa" w:w="40"/>
-              <w:right w:type="dxa" w:w="80"/>
-            </w:tcMar>
-          </w:tcPr>
-          <w:p>
-            <w:r>
-              <w:rPr>
-                <w:b/>
-                <w:bCs/>
-              </w:rPr>
-              <w:t xml:space="preserve"/>
-            </w:r>
-          </w:p>
-        </w:tc>
-        <w:tc>
-          <w:tcPr>
-            <w:tcW w:type="dxa" w:w="1872"/>
-            <w:shd w:fill="E8ECF7" w:val="clear"/>
-            <w:tcMar>
-              <w:top w:type="dxa" w:w="40"/>
-              <w:left w:type="dxa" w:w="80"/>
-              <w:bottom w:type="dxa" w:w="40"/>
-              <w:right w:type="dxa" w:w="80"/>
-            </w:tcMar>
-          </w:tcPr>
-          <w:p>
-            <w:r>
-              <w:rPr>
-                <w:b/>
-                <w:bCs/>
-              </w:rPr>
-              <w:t xml:space="preserve"/>
             </w:r>
           </w:p>
         </w:tc>
@@ -4355,7 +4321,7 @@
         </w:trPr>
         <w:tc>
           <w:tcPr>
-            <w:tcW w:type="dxa" w:w="1872"/>
+            <w:tcW w:type="dxa" w:w="3120"/>
             <w:tcMar>
               <w:top w:type="dxa" w:w="40"/>
               <w:left w:type="dxa" w:w="80"/>
@@ -4374,7 +4340,7 @@
         </w:tc>
         <w:tc>
           <w:tcPr>
-            <w:tcW w:type="dxa" w:w="1872"/>
+            <w:tcW w:type="dxa" w:w="3120"/>
             <w:tcMar>
               <w:top w:type="dxa" w:w="40"/>
               <w:left w:type="dxa" w:w="80"/>
@@ -4390,39 +4356,7 @@
         </w:tc>
         <w:tc>
           <w:tcPr>
-            <w:tcW w:type="dxa" w:w="1872"/>
-            <w:tcMar>
-              <w:top w:type="dxa" w:w="40"/>
-              <w:left w:type="dxa" w:w="80"/>
-              <w:bottom w:type="dxa" w:w="40"/>
-              <w:right w:type="dxa" w:w="80"/>
-            </w:tcMar>
-          </w:tcPr>
-          <w:p>
-            <w:r>
-              <w:t xml:space="preserve"/>
-            </w:r>
-          </w:p>
-        </w:tc>
-        <w:tc>
-          <w:tcPr>
-            <w:tcW w:type="dxa" w:w="1872"/>
-            <w:tcMar>
-              <w:top w:type="dxa" w:w="40"/>
-              <w:left w:type="dxa" w:w="80"/>
-              <w:bottom w:type="dxa" w:w="40"/>
-              <w:right w:type="dxa" w:w="80"/>
-            </w:tcMar>
-          </w:tcPr>
-          <w:p>
-            <w:r>
-              <w:t xml:space="preserve"/>
-            </w:r>
-          </w:p>
-        </w:tc>
-        <w:tc>
-          <w:tcPr>
-            <w:tcW w:type="dxa" w:w="1872"/>
+            <w:tcW w:type="dxa" w:w="3120"/>
             <w:tcMar>
               <w:top w:type="dxa" w:w="40"/>
               <w:left w:type="dxa" w:w="80"/>
@@ -4443,7 +4377,7 @@
         </w:trPr>
         <w:tc>
           <w:tcPr>
-            <w:tcW w:type="dxa" w:w="1872"/>
+            <w:tcW w:type="dxa" w:w="3120"/>
             <w:tcMar>
               <w:top w:type="dxa" w:w="40"/>
               <w:left w:type="dxa" w:w="80"/>
@@ -4462,7 +4396,7 @@
         </w:tc>
         <w:tc>
           <w:tcPr>
-            <w:tcW w:type="dxa" w:w="1872"/>
+            <w:tcW w:type="dxa" w:w="3120"/>
             <w:tcMar>
               <w:top w:type="dxa" w:w="40"/>
               <w:left w:type="dxa" w:w="80"/>
@@ -4478,49 +4412,17 @@
         </w:tc>
         <w:tc>
           <w:tcPr>
-            <w:tcW w:type="dxa" w:w="1872"/>
-            <w:tcMar>
-              <w:top w:type="dxa" w:w="40"/>
-              <w:left w:type="dxa" w:w="80"/>
-              <w:bottom w:type="dxa" w:w="40"/>
-              <w:right w:type="dxa" w:w="80"/>
-            </w:tcMar>
-          </w:tcPr>
-          <w:p>
-            <w:r>
-              <w:t xml:space="preserve"/>
-            </w:r>
-          </w:p>
-        </w:tc>
-        <w:tc>
-          <w:tcPr>
-            <w:tcW w:type="dxa" w:w="1872"/>
-            <w:tcMar>
-              <w:top w:type="dxa" w:w="40"/>
-              <w:left w:type="dxa" w:w="80"/>
-              <w:bottom w:type="dxa" w:w="40"/>
-              <w:right w:type="dxa" w:w="80"/>
-            </w:tcMar>
-          </w:tcPr>
-          <w:p>
-            <w:r>
-              <w:t xml:space="preserve"/>
-            </w:r>
-          </w:p>
-        </w:tc>
-        <w:tc>
-          <w:tcPr>
-            <w:tcW w:type="dxa" w:w="1872"/>
-            <w:tcMar>
-              <w:top w:type="dxa" w:w="40"/>
-              <w:left w:type="dxa" w:w="80"/>
-              <w:bottom w:type="dxa" w:w="40"/>
-              <w:right w:type="dxa" w:w="80"/>
-            </w:tcMar>
-          </w:tcPr>
-          <w:p>
-            <w:r>
-              <w:t xml:space="preserve"/>
+            <w:tcW w:type="dxa" w:w="3120"/>
+            <w:tcMar>
+              <w:top w:type="dxa" w:w="40"/>
+              <w:left w:type="dxa" w:w="80"/>
+              <w:bottom w:type="dxa" w:w="40"/>
+              <w:right w:type="dxa" w:w="80"/>
+            </w:tcMar>
+          </w:tcPr>
+          <w:p>
+            <w:r>
+              <w:t xml:space="preserve">e.g. "Mathematics"</w:t>
             </w:r>
           </w:p>
         </w:tc>
@@ -4531,84 +4433,52 @@
         </w:trPr>
         <w:tc>
           <w:tcPr>
-            <w:tcW w:type="dxa" w:w="1872"/>
-            <w:tcMar>
-              <w:top w:type="dxa" w:w="40"/>
-              <w:left w:type="dxa" w:w="80"/>
-              <w:bottom w:type="dxa" w:w="40"/>
-              <w:right w:type="dxa" w:w="80"/>
-            </w:tcMar>
-          </w:tcPr>
-          <w:p>
-            <w:r>
-              <w:rPr>
-                <w:rFonts w:ascii="Consolas" w:cs="Consolas" w:eastAsia="Consolas" w:hAnsi="Consolas"/>
-              </w:rPr>
-              <w:t xml:space="preserve">description</w:t>
-            </w:r>
-          </w:p>
-        </w:tc>
-        <w:tc>
-          <w:tcPr>
-            <w:tcW w:type="dxa" w:w="1872"/>
-            <w:tcMar>
-              <w:top w:type="dxa" w:w="40"/>
-              <w:left w:type="dxa" w:w="80"/>
-              <w:bottom w:type="dxa" w:w="40"/>
-              <w:right w:type="dxa" w:w="80"/>
-            </w:tcMar>
-          </w:tcPr>
-          <w:p>
-            <w:r>
-              <w:t xml:space="preserve">text</w:t>
-            </w:r>
-          </w:p>
-        </w:tc>
-        <w:tc>
-          <w:tcPr>
-            <w:tcW w:type="dxa" w:w="1872"/>
-            <w:tcMar>
-              <w:top w:type="dxa" w:w="40"/>
-              <w:left w:type="dxa" w:w="80"/>
-              <w:bottom w:type="dxa" w:w="40"/>
-              <w:right w:type="dxa" w:w="80"/>
-            </w:tcMar>
-          </w:tcPr>
-          <w:p>
-            <w:r>
-              <w:t xml:space="preserve"/>
-            </w:r>
-          </w:p>
-        </w:tc>
-        <w:tc>
-          <w:tcPr>
-            <w:tcW w:type="dxa" w:w="1872"/>
-            <w:tcMar>
-              <w:top w:type="dxa" w:w="40"/>
-              <w:left w:type="dxa" w:w="80"/>
-              <w:bottom w:type="dxa" w:w="40"/>
-              <w:right w:type="dxa" w:w="80"/>
-            </w:tcMar>
-          </w:tcPr>
-          <w:p>
-            <w:r>
-              <w:t xml:space="preserve"/>
-            </w:r>
-          </w:p>
-        </w:tc>
-        <w:tc>
-          <w:tcPr>
-            <w:tcW w:type="dxa" w:w="1872"/>
-            <w:tcMar>
-              <w:top w:type="dxa" w:w="40"/>
-              <w:left w:type="dxa" w:w="80"/>
-              <w:bottom w:type="dxa" w:w="40"/>
-              <w:right w:type="dxa" w:w="80"/>
-            </w:tcMar>
-          </w:tcPr>
-          <w:p>
-            <w:r>
-              <w:t xml:space="preserve"/>
+            <w:tcW w:type="dxa" w:w="3120"/>
+            <w:tcMar>
+              <w:top w:type="dxa" w:w="40"/>
+              <w:left w:type="dxa" w:w="80"/>
+              <w:bottom w:type="dxa" w:w="40"/>
+              <w:right w:type="dxa" w:w="80"/>
+            </w:tcMar>
+          </w:tcPr>
+          <w:p>
+            <w:r>
+              <w:rPr>
+                <w:rFonts w:ascii="Consolas" w:cs="Consolas" w:eastAsia="Consolas" w:hAnsi="Consolas"/>
+              </w:rPr>
+              <w:t xml:space="preserve">subject</w:t>
+            </w:r>
+          </w:p>
+        </w:tc>
+        <w:tc>
+          <w:tcPr>
+            <w:tcW w:type="dxa" w:w="3120"/>
+            <w:tcMar>
+              <w:top w:type="dxa" w:w="40"/>
+              <w:left w:type="dxa" w:w="80"/>
+              <w:bottom w:type="dxa" w:w="40"/>
+              <w:right w:type="dxa" w:w="80"/>
+            </w:tcMar>
+          </w:tcPr>
+          <w:p>
+            <w:r>
+              <w:t xml:space="preserve">string</w:t>
+            </w:r>
+          </w:p>
+        </w:tc>
+        <w:tc>
+          <w:tcPr>
+            <w:tcW w:type="dxa" w:w="3120"/>
+            <w:tcMar>
+              <w:top w:type="dxa" w:w="40"/>
+              <w:left w:type="dxa" w:w="80"/>
+              <w:bottom w:type="dxa" w:w="40"/>
+              <w:right w:type="dxa" w:w="80"/>
+            </w:tcMar>
+          </w:tcPr>
+          <w:p>
+            <w:r>
+              <w:t xml:space="preserve">e.g. Mathematics</w:t>
             </w:r>
           </w:p>
         </w:tc>
@@ -4619,84 +4489,108 @@
         </w:trPr>
         <w:tc>
           <w:tcPr>
-            <w:tcW w:type="dxa" w:w="1872"/>
-            <w:tcMar>
-              <w:top w:type="dxa" w:w="40"/>
-              <w:left w:type="dxa" w:w="80"/>
-              <w:bottom w:type="dxa" w:w="40"/>
-              <w:right w:type="dxa" w:w="80"/>
-            </w:tcMar>
-          </w:tcPr>
-          <w:p>
+            <w:tcW w:type="dxa" w:w="3120"/>
+            <w:tcMar>
+              <w:top w:type="dxa" w:w="40"/>
+              <w:left w:type="dxa" w:w="80"/>
+              <w:bottom w:type="dxa" w:w="40"/>
+              <w:right w:type="dxa" w:w="80"/>
+            </w:tcMar>
+          </w:tcPr>
+          <w:p>
+            <w:r>
+              <w:rPr>
+                <w:rFonts w:ascii="Consolas" w:cs="Consolas" w:eastAsia="Consolas" w:hAnsi="Consolas"/>
+              </w:rPr>
+              <w:t xml:space="preserve">category</w:t>
+            </w:r>
+          </w:p>
+        </w:tc>
+        <w:tc>
+          <w:tcPr>
+            <w:tcW w:type="dxa" w:w="3120"/>
+            <w:tcMar>
+              <w:top w:type="dxa" w:w="40"/>
+              <w:left w:type="dxa" w:w="80"/>
+              <w:bottom w:type="dxa" w:w="40"/>
+              <w:right w:type="dxa" w:w="80"/>
+            </w:tcMar>
+          </w:tcPr>
+          <w:p>
+            <w:r>
+              <w:t xml:space="preserve">enum</w:t>
+            </w:r>
+          </w:p>
+        </w:tc>
+        <w:tc>
+          <w:tcPr>
+            <w:tcW w:type="dxa" w:w="3120"/>
+            <w:tcMar>
+              <w:top w:type="dxa" w:w="40"/>
+              <w:left w:type="dxa" w:w="80"/>
+              <w:bottom w:type="dxa" w:w="40"/>
+              <w:right w:type="dxa" w:w="80"/>
+            </w:tcMar>
+          </w:tcPr>
+          <w:p>
+            <w:r>
+              <w:rPr>
+                <w:b/>
+                <w:bCs/>
+              </w:rPr>
+              <w:t xml:space="preserve">`waec-sss`</w:t>
+            </w:r>
+            <w:r>
+              <w:t xml:space="preserve"> (WAEC + SS1–SS3) · </w:t>
+            </w:r>
+            <w:r>
+              <w:rPr>
+                <w:b/>
+                <w:bCs/>
+              </w:rPr>
+              <w:t xml:space="preserve">`jamb-putme`</w:t>
+            </w:r>
+            <w:r>
+              <w:t xml:space="preserve"> (JAMB </w:t>
+            </w:r>
+            <w:r>
+              <w:rPr>
+                <w:b/>
+                <w:bCs/>
+              </w:rPr>
+              <w:t xml:space="preserve">and</w:t>
+            </w:r>
+            <w:r>
+              <w:t xml:space="preserve"> Post-UTME — same courses) · </w:t>
+            </w:r>
+            <w:r>
+              <w:rPr>
+                <w:b/>
+                <w:bCs/>
+              </w:rPr>
+              <w:t xml:space="preserve">`higher`</w:t>
+            </w:r>
+            <w:r>
+              <w:t xml:space="preserve"> (100/200 level). </w:t>
+            </w:r>
+            <w:r>
+              <w:rPr>
+                <w:b/>
+                <w:bCs/>
+              </w:rPr>
+              <w:t xml:space="preserve">This is the grouping the app uses</w:t>
+            </w:r>
+            <w:r>
+              <w:t xml:space="preserve">, not </w:t>
+            </w:r>
             <w:r>
               <w:rPr>
                 <w:rFonts w:ascii="Consolas" w:cs="Consolas" w:eastAsia="Consolas" w:hAnsi="Consolas"/>
               </w:rPr>
               <w:t xml:space="preserve">examTrack</w:t>
             </w:r>
-          </w:p>
-        </w:tc>
-        <w:tc>
-          <w:tcPr>
-            <w:tcW w:type="dxa" w:w="1872"/>
-            <w:tcMar>
-              <w:top w:type="dxa" w:w="40"/>
-              <w:left w:type="dxa" w:w="80"/>
-              <w:bottom w:type="dxa" w:w="40"/>
-              <w:right w:type="dxa" w:w="80"/>
-            </w:tcMar>
-          </w:tcPr>
-          <w:p>
-            <w:r>
-              <w:t xml:space="preserve">enum</w:t>
-            </w:r>
-          </w:p>
-        </w:tc>
-        <w:tc>
-          <w:tcPr>
-            <w:tcW w:type="dxa" w:w="1872"/>
-            <w:tcMar>
-              <w:top w:type="dxa" w:w="40"/>
-              <w:left w:type="dxa" w:w="80"/>
-              <w:bottom w:type="dxa" w:w="40"/>
-              <w:right w:type="dxa" w:w="80"/>
-            </w:tcMar>
-          </w:tcPr>
-          <w:p>
-            <w:r>
-              <w:t xml:space="preserve">jamb \</w:t>
-            </w:r>
-          </w:p>
-        </w:tc>
-        <w:tc>
-          <w:tcPr>
-            <w:tcW w:type="dxa" w:w="1872"/>
-            <w:tcMar>
-              <w:top w:type="dxa" w:w="40"/>
-              <w:left w:type="dxa" w:w="80"/>
-              <w:bottom w:type="dxa" w:w="40"/>
-              <w:right w:type="dxa" w:w="80"/>
-            </w:tcMar>
-          </w:tcPr>
-          <w:p>
-            <w:r>
-              <w:t xml:space="preserve">waec \</w:t>
-            </w:r>
-          </w:p>
-        </w:tc>
-        <w:tc>
-          <w:tcPr>
-            <w:tcW w:type="dxa" w:w="1872"/>
-            <w:tcMar>
-              <w:top w:type="dxa" w:w="40"/>
-              <w:left w:type="dxa" w:w="80"/>
-              <w:bottom w:type="dxa" w:w="40"/>
-              <w:right w:type="dxa" w:w="80"/>
-            </w:tcMar>
-          </w:tcPr>
-          <w:p>
-            <w:r>
-              <w:t xml:space="preserve">postutme</w:t>
+            <w:r>
+              <w:t xml:space="preserve">.</w:t>
             </w:r>
           </w:p>
         </w:tc>
@@ -4707,84 +4601,59 @@
         </w:trPr>
         <w:tc>
           <w:tcPr>
-            <w:tcW w:type="dxa" w:w="1872"/>
-            <w:tcMar>
-              <w:top w:type="dxa" w:w="40"/>
-              <w:left w:type="dxa" w:w="80"/>
-              <w:bottom w:type="dxa" w:w="40"/>
-              <w:right w:type="dxa" w:w="80"/>
-            </w:tcMar>
-          </w:tcPr>
-          <w:p>
-            <w:r>
-              <w:rPr>
-                <w:rFonts w:ascii="Consolas" w:cs="Consolas" w:eastAsia="Consolas" w:hAnsi="Consolas"/>
-              </w:rPr>
-              <w:t xml:space="preserve">department</w:t>
-            </w:r>
-          </w:p>
-        </w:tc>
-        <w:tc>
-          <w:tcPr>
-            <w:tcW w:type="dxa" w:w="1872"/>
-            <w:tcMar>
-              <w:top w:type="dxa" w:w="40"/>
-              <w:left w:type="dxa" w:w="80"/>
-              <w:bottom w:type="dxa" w:w="40"/>
-              <w:right w:type="dxa" w:w="80"/>
-            </w:tcMar>
-          </w:tcPr>
-          <w:p>
-            <w:r>
-              <w:t xml:space="preserve">enum?</w:t>
-            </w:r>
-          </w:p>
-        </w:tc>
-        <w:tc>
-          <w:tcPr>
-            <w:tcW w:type="dxa" w:w="1872"/>
-            <w:tcMar>
-              <w:top w:type="dxa" w:w="40"/>
-              <w:left w:type="dxa" w:w="80"/>
-              <w:bottom w:type="dxa" w:w="40"/>
-              <w:right w:type="dxa" w:w="80"/>
-            </w:tcMar>
-          </w:tcPr>
-          <w:p>
-            <w:r>
-              <w:t xml:space="preserve">WAEC only</w:t>
-            </w:r>
-          </w:p>
-        </w:tc>
-        <w:tc>
-          <w:tcPr>
-            <w:tcW w:type="dxa" w:w="1872"/>
-            <w:tcMar>
-              <w:top w:type="dxa" w:w="40"/>
-              <w:left w:type="dxa" w:w="80"/>
-              <w:bottom w:type="dxa" w:w="40"/>
-              <w:right w:type="dxa" w:w="80"/>
-            </w:tcMar>
-          </w:tcPr>
-          <w:p>
-            <w:r>
-              <w:t xml:space="preserve"/>
-            </w:r>
-          </w:p>
-        </w:tc>
-        <w:tc>
-          <w:tcPr>
-            <w:tcW w:type="dxa" w:w="1872"/>
-            <w:tcMar>
-              <w:top w:type="dxa" w:w="40"/>
-              <w:left w:type="dxa" w:w="80"/>
-              <w:bottom w:type="dxa" w:w="40"/>
-              <w:right w:type="dxa" w:w="80"/>
-            </w:tcMar>
-          </w:tcPr>
-          <w:p>
-            <w:r>
-              <w:t xml:space="preserve"/>
+            <w:tcW w:type="dxa" w:w="3120"/>
+            <w:tcMar>
+              <w:top w:type="dxa" w:w="40"/>
+              <w:left w:type="dxa" w:w="80"/>
+              <w:bottom w:type="dxa" w:w="40"/>
+              <w:right w:type="dxa" w:w="80"/>
+            </w:tcMar>
+          </w:tcPr>
+          <w:p>
+            <w:r>
+              <w:rPr>
+                <w:rFonts w:ascii="Consolas" w:cs="Consolas" w:eastAsia="Consolas" w:hAnsi="Consolas"/>
+              </w:rPr>
+              <w:t xml:space="preserve">tutorId</w:t>
+            </w:r>
+          </w:p>
+        </w:tc>
+        <w:tc>
+          <w:tcPr>
+            <w:tcW w:type="dxa" w:w="3120"/>
+            <w:tcMar>
+              <w:top w:type="dxa" w:w="40"/>
+              <w:left w:type="dxa" w:w="80"/>
+              <w:bottom w:type="dxa" w:w="40"/>
+              <w:right w:type="dxa" w:w="80"/>
+            </w:tcMar>
+          </w:tcPr>
+          <w:p>
+            <w:r>
+              <w:t xml:space="preserve">FK→User?</w:t>
+            </w:r>
+          </w:p>
+        </w:tc>
+        <w:tc>
+          <w:tcPr>
+            <w:tcW w:type="dxa" w:w="3120"/>
+            <w:tcMar>
+              <w:top w:type="dxa" w:w="40"/>
+              <w:left w:type="dxa" w:w="80"/>
+              <w:bottom w:type="dxa" w:w="40"/>
+              <w:right w:type="dxa" w:w="80"/>
+            </w:tcMar>
+          </w:tcPr>
+          <w:p>
+            <w:r>
+              <w:rPr>
+                <w:b/>
+                <w:bCs/>
+              </w:rPr>
+              <w:t xml:space="preserve">assigned tutor</w:t>
+            </w:r>
+            <w:r>
+              <w:t xml:space="preserve"> (admin assigns). A student sees this tutor; the tutor sees students in the course's category</w:t>
             </w:r>
           </w:p>
         </w:tc>
@@ -4795,74 +4664,42 @@
         </w:trPr>
         <w:tc>
           <w:tcPr>
-            <w:tcW w:type="dxa" w:w="1872"/>
-            <w:tcMar>
-              <w:top w:type="dxa" w:w="40"/>
-              <w:left w:type="dxa" w:w="80"/>
-              <w:bottom w:type="dxa" w:w="40"/>
-              <w:right w:type="dxa" w:w="80"/>
-            </w:tcMar>
-          </w:tcPr>
-          <w:p>
-            <w:r>
-              <w:rPr>
-                <w:rFonts w:ascii="Consolas" w:cs="Consolas" w:eastAsia="Consolas" w:hAnsi="Consolas"/>
-              </w:rPr>
-              <w:t xml:space="preserve">subject</w:t>
-            </w:r>
-          </w:p>
-        </w:tc>
-        <w:tc>
-          <w:tcPr>
-            <w:tcW w:type="dxa" w:w="1872"/>
-            <w:tcMar>
-              <w:top w:type="dxa" w:w="40"/>
-              <w:left w:type="dxa" w:w="80"/>
-              <w:bottom w:type="dxa" w:w="40"/>
-              <w:right w:type="dxa" w:w="80"/>
-            </w:tcMar>
-          </w:tcPr>
-          <w:p>
-            <w:r>
-              <w:t xml:space="preserve">string</w:t>
-            </w:r>
-          </w:p>
-        </w:tc>
-        <w:tc>
-          <w:tcPr>
-            <w:tcW w:type="dxa" w:w="1872"/>
-            <w:tcMar>
-              <w:top w:type="dxa" w:w="40"/>
-              <w:left w:type="dxa" w:w="80"/>
-              <w:bottom w:type="dxa" w:w="40"/>
-              <w:right w:type="dxa" w:w="80"/>
-            </w:tcMar>
-          </w:tcPr>
-          <w:p>
-            <w:r>
-              <w:t xml:space="preserve">e.g. Mathematics</w:t>
-            </w:r>
-          </w:p>
-        </w:tc>
-        <w:tc>
-          <w:tcPr>
-            <w:tcW w:type="dxa" w:w="1872"/>
-            <w:tcMar>
-              <w:top w:type="dxa" w:w="40"/>
-              <w:left w:type="dxa" w:w="80"/>
-              <w:bottom w:type="dxa" w:w="40"/>
-              <w:right w:type="dxa" w:w="80"/>
-            </w:tcMar>
-          </w:tcPr>
-          <w:p>
-            <w:r>
-              <w:t xml:space="preserve"/>
-            </w:r>
-          </w:p>
-        </w:tc>
-        <w:tc>
-          <w:tcPr>
-            <w:tcW w:type="dxa" w:w="1872"/>
+            <w:tcW w:type="dxa" w:w="3120"/>
+            <w:tcMar>
+              <w:top w:type="dxa" w:w="40"/>
+              <w:left w:type="dxa" w:w="80"/>
+              <w:bottom w:type="dxa" w:w="40"/>
+              <w:right w:type="dxa" w:w="80"/>
+            </w:tcMar>
+          </w:tcPr>
+          <w:p>
+            <w:r>
+              <w:rPr>
+                <w:rFonts w:ascii="Consolas" w:cs="Consolas" w:eastAsia="Consolas" w:hAnsi="Consolas"/>
+              </w:rPr>
+              <w:t xml:space="preserve">description</w:t>
+            </w:r>
+          </w:p>
+        </w:tc>
+        <w:tc>
+          <w:tcPr>
+            <w:tcW w:type="dxa" w:w="3120"/>
+            <w:tcMar>
+              <w:top w:type="dxa" w:w="40"/>
+              <w:left w:type="dxa" w:w="80"/>
+              <w:bottom w:type="dxa" w:w="40"/>
+              <w:right w:type="dxa" w:w="80"/>
+            </w:tcMar>
+          </w:tcPr>
+          <w:p>
+            <w:r>
+              <w:t xml:space="preserve">text?</w:t>
+            </w:r>
+          </w:p>
+        </w:tc>
+        <w:tc>
+          <w:tcPr>
+            <w:tcW w:type="dxa" w:w="3120"/>
             <w:tcMar>
               <w:top w:type="dxa" w:w="40"/>
               <w:left w:type="dxa" w:w="80"/>
@@ -4883,84 +4720,52 @@
         </w:trPr>
         <w:tc>
           <w:tcPr>
-            <w:tcW w:type="dxa" w:w="1872"/>
-            <w:tcMar>
-              <w:top w:type="dxa" w:w="40"/>
-              <w:left w:type="dxa" w:w="80"/>
-              <w:bottom w:type="dxa" w:w="40"/>
-              <w:right w:type="dxa" w:w="80"/>
-            </w:tcMar>
-          </w:tcPr>
-          <w:p>
-            <w:r>
-              <w:rPr>
-                <w:rFonts w:ascii="Consolas" w:cs="Consolas" w:eastAsia="Consolas" w:hAnsi="Consolas"/>
-              </w:rPr>
-              <w:t xml:space="preserve">tutorId</w:t>
-            </w:r>
-          </w:p>
-        </w:tc>
-        <w:tc>
-          <w:tcPr>
-            <w:tcW w:type="dxa" w:w="1872"/>
-            <w:tcMar>
-              <w:top w:type="dxa" w:w="40"/>
-              <w:left w:type="dxa" w:w="80"/>
-              <w:bottom w:type="dxa" w:w="40"/>
-              <w:right w:type="dxa" w:w="80"/>
-            </w:tcMar>
-          </w:tcPr>
-          <w:p>
-            <w:r>
-              <w:t xml:space="preserve">FK→User</w:t>
-            </w:r>
-          </w:p>
-        </w:tc>
-        <w:tc>
-          <w:tcPr>
-            <w:tcW w:type="dxa" w:w="1872"/>
-            <w:tcMar>
-              <w:top w:type="dxa" w:w="40"/>
-              <w:left w:type="dxa" w:w="80"/>
-              <w:bottom w:type="dxa" w:w="40"/>
-              <w:right w:type="dxa" w:w="80"/>
-            </w:tcMar>
-          </w:tcPr>
-          <w:p>
-            <w:r>
-              <w:t xml:space="preserve">owning tutor</w:t>
-            </w:r>
-          </w:p>
-        </w:tc>
-        <w:tc>
-          <w:tcPr>
-            <w:tcW w:type="dxa" w:w="1872"/>
-            <w:tcMar>
-              <w:top w:type="dxa" w:w="40"/>
-              <w:left w:type="dxa" w:w="80"/>
-              <w:bottom w:type="dxa" w:w="40"/>
-              <w:right w:type="dxa" w:w="80"/>
-            </w:tcMar>
-          </w:tcPr>
-          <w:p>
-            <w:r>
-              <w:t xml:space="preserve"/>
-            </w:r>
-          </w:p>
-        </w:tc>
-        <w:tc>
-          <w:tcPr>
-            <w:tcW w:type="dxa" w:w="1872"/>
-            <w:tcMar>
-              <w:top w:type="dxa" w:w="40"/>
-              <w:left w:type="dxa" w:w="80"/>
-              <w:bottom w:type="dxa" w:w="40"/>
-              <w:right w:type="dxa" w:w="80"/>
-            </w:tcMar>
-          </w:tcPr>
-          <w:p>
-            <w:r>
-              <w:t xml:space="preserve"/>
+            <w:tcW w:type="dxa" w:w="3120"/>
+            <w:tcMar>
+              <w:top w:type="dxa" w:w="40"/>
+              <w:left w:type="dxa" w:w="80"/>
+              <w:bottom w:type="dxa" w:w="40"/>
+              <w:right w:type="dxa" w:w="80"/>
+            </w:tcMar>
+          </w:tcPr>
+          <w:p>
+            <w:r>
+              <w:rPr>
+                <w:rFonts w:ascii="Consolas" w:cs="Consolas" w:eastAsia="Consolas" w:hAnsi="Consolas"/>
+              </w:rPr>
+              <w:t xml:space="preserve">department</w:t>
+            </w:r>
+          </w:p>
+        </w:tc>
+        <w:tc>
+          <w:tcPr>
+            <w:tcW w:type="dxa" w:w="3120"/>
+            <w:tcMar>
+              <w:top w:type="dxa" w:w="40"/>
+              <w:left w:type="dxa" w:w="80"/>
+              <w:bottom w:type="dxa" w:w="40"/>
+              <w:right w:type="dxa" w:w="80"/>
+            </w:tcMar>
+          </w:tcPr>
+          <w:p>
+            <w:r>
+              <w:t xml:space="preserve">enum?</w:t>
+            </w:r>
+          </w:p>
+        </w:tc>
+        <w:tc>
+          <w:tcPr>
+            <w:tcW w:type="dxa" w:w="3120"/>
+            <w:tcMar>
+              <w:top w:type="dxa" w:w="40"/>
+              <w:left w:type="dxa" w:w="80"/>
+              <w:bottom w:type="dxa" w:w="40"/>
+              <w:right w:type="dxa" w:w="80"/>
+            </w:tcMar>
+          </w:tcPr>
+          <w:p>
+            <w:r>
+              <w:t xml:space="preserve">WAEC only</w:t>
             </w:r>
           </w:p>
         </w:tc>
@@ -4971,7 +4776,7 @@
         </w:trPr>
         <w:tc>
           <w:tcPr>
-            <w:tcW w:type="dxa" w:w="1872"/>
+            <w:tcW w:type="dxa" w:w="3120"/>
             <w:tcMar>
               <w:top w:type="dxa" w:w="40"/>
               <w:left w:type="dxa" w:w="80"/>
@@ -4990,7 +4795,7 @@
         </w:tc>
         <w:tc>
           <w:tcPr>
-            <w:tcW w:type="dxa" w:w="1872"/>
+            <w:tcW w:type="dxa" w:w="3120"/>
             <w:tcMar>
               <w:top w:type="dxa" w:w="40"/>
               <w:left w:type="dxa" w:w="80"/>
@@ -5006,39 +4811,7 @@
         </w:tc>
         <w:tc>
           <w:tcPr>
-            <w:tcW w:type="dxa" w:w="1872"/>
-            <w:tcMar>
-              <w:top w:type="dxa" w:w="40"/>
-              <w:left w:type="dxa" w:w="80"/>
-              <w:bottom w:type="dxa" w:w="40"/>
-              <w:right w:type="dxa" w:w="80"/>
-            </w:tcMar>
-          </w:tcPr>
-          <w:p>
-            <w:r>
-              <w:t xml:space="preserve"/>
-            </w:r>
-          </w:p>
-        </w:tc>
-        <w:tc>
-          <w:tcPr>
-            <w:tcW w:type="dxa" w:w="1872"/>
-            <w:tcMar>
-              <w:top w:type="dxa" w:w="40"/>
-              <w:left w:type="dxa" w:w="80"/>
-              <w:bottom w:type="dxa" w:w="40"/>
-              <w:right w:type="dxa" w:w="80"/>
-            </w:tcMar>
-          </w:tcPr>
-          <w:p>
-            <w:r>
-              <w:t xml:space="preserve"/>
-            </w:r>
-          </w:p>
-        </w:tc>
-        <w:tc>
-          <w:tcPr>
-            <w:tcW w:type="dxa" w:w="1872"/>
+            <w:tcW w:type="dxa" w:w="3120"/>
             <w:tcMar>
               <w:top w:type="dxa" w:w="40"/>
               <w:left w:type="dxa" w:w="80"/>
@@ -5059,84 +4832,52 @@
         </w:trPr>
         <w:tc>
           <w:tcPr>
-            <w:tcW w:type="dxa" w:w="1872"/>
-            <w:tcMar>
-              <w:top w:type="dxa" w:w="40"/>
-              <w:left w:type="dxa" w:w="80"/>
-              <w:bottom w:type="dxa" w:w="40"/>
-              <w:right w:type="dxa" w:w="80"/>
-            </w:tcMar>
-          </w:tcPr>
-          <w:p>
-            <w:r>
-              <w:rPr>
-                <w:rFonts w:ascii="Consolas" w:cs="Consolas" w:eastAsia="Consolas" w:hAnsi="Consolas"/>
-              </w:rPr>
-              <w:t xml:space="preserve">level</w:t>
-            </w:r>
-          </w:p>
-        </w:tc>
-        <w:tc>
-          <w:tcPr>
-            <w:tcW w:type="dxa" w:w="1872"/>
-            <w:tcMar>
-              <w:top w:type="dxa" w:w="40"/>
-              <w:left w:type="dxa" w:w="80"/>
-              <w:bottom w:type="dxa" w:w="40"/>
-              <w:right w:type="dxa" w:w="80"/>
-            </w:tcMar>
-          </w:tcPr>
-          <w:p>
-            <w:r>
-              <w:t xml:space="preserve">string?</w:t>
-            </w:r>
-          </w:p>
-        </w:tc>
-        <w:tc>
-          <w:tcPr>
-            <w:tcW w:type="dxa" w:w="1872"/>
-            <w:tcMar>
-              <w:top w:type="dxa" w:w="40"/>
-              <w:left w:type="dxa" w:w="80"/>
-              <w:bottom w:type="dxa" w:w="40"/>
-              <w:right w:type="dxa" w:w="80"/>
-            </w:tcMar>
-          </w:tcPr>
-          <w:p>
-            <w:r>
-              <w:t xml:space="preserve"/>
-            </w:r>
-          </w:p>
-        </w:tc>
-        <w:tc>
-          <w:tcPr>
-            <w:tcW w:type="dxa" w:w="1872"/>
-            <w:tcMar>
-              <w:top w:type="dxa" w:w="40"/>
-              <w:left w:type="dxa" w:w="80"/>
-              <w:bottom w:type="dxa" w:w="40"/>
-              <w:right w:type="dxa" w:w="80"/>
-            </w:tcMar>
-          </w:tcPr>
-          <w:p>
-            <w:r>
-              <w:t xml:space="preserve"/>
-            </w:r>
-          </w:p>
-        </w:tc>
-        <w:tc>
-          <w:tcPr>
-            <w:tcW w:type="dxa" w:w="1872"/>
-            <w:tcMar>
-              <w:top w:type="dxa" w:w="40"/>
-              <w:left w:type="dxa" w:w="80"/>
-              <w:bottom w:type="dxa" w:w="40"/>
-              <w:right w:type="dxa" w:w="80"/>
-            </w:tcMar>
-          </w:tcPr>
-          <w:p>
-            <w:r>
-              <w:t xml:space="preserve"/>
+            <w:tcW w:type="dxa" w:w="3120"/>
+            <w:tcMar>
+              <w:top w:type="dxa" w:w="40"/>
+              <w:left w:type="dxa" w:w="80"/>
+              <w:bottom w:type="dxa" w:w="40"/>
+              <w:right w:type="dxa" w:w="80"/>
+            </w:tcMar>
+          </w:tcPr>
+          <w:p>
+            <w:r>
+              <w:rPr>
+                <w:rFonts w:ascii="Consolas" w:cs="Consolas" w:eastAsia="Consolas" w:hAnsi="Consolas"/>
+              </w:rPr>
+              <w:t xml:space="preserve">price</w:t>
+            </w:r>
+          </w:p>
+        </w:tc>
+        <w:tc>
+          <w:tcPr>
+            <w:tcW w:type="dxa" w:w="3120"/>
+            <w:tcMar>
+              <w:top w:type="dxa" w:w="40"/>
+              <w:left w:type="dxa" w:w="80"/>
+              <w:bottom w:type="dxa" w:w="40"/>
+              <w:right w:type="dxa" w:w="80"/>
+            </w:tcMar>
+          </w:tcPr>
+          <w:p>
+            <w:r>
+              <w:t xml:space="preserve">int (kobo)?</w:t>
+            </w:r>
+          </w:p>
+        </w:tc>
+        <w:tc>
+          <w:tcPr>
+            <w:tcW w:type="dxa" w:w="3120"/>
+            <w:tcMar>
+              <w:top w:type="dxa" w:w="40"/>
+              <w:left w:type="dxa" w:w="80"/>
+              <w:bottom w:type="dxa" w:w="40"/>
+              <w:right w:type="dxa" w:w="80"/>
+            </w:tcMar>
+          </w:tcPr>
+          <w:p>
+            <w:r>
+              <w:t xml:space="preserve">0/absent = free with portal access</w:t>
             </w:r>
           </w:p>
         </w:tc>
@@ -5147,74 +4888,42 @@
         </w:trPr>
         <w:tc>
           <w:tcPr>
-            <w:tcW w:type="dxa" w:w="1872"/>
-            <w:tcMar>
-              <w:top w:type="dxa" w:w="40"/>
-              <w:left w:type="dxa" w:w="80"/>
-              <w:bottom w:type="dxa" w:w="40"/>
-              <w:right w:type="dxa" w:w="80"/>
-            </w:tcMar>
-          </w:tcPr>
-          <w:p>
-            <w:r>
-              <w:rPr>
-                <w:rFonts w:ascii="Consolas" w:cs="Consolas" w:eastAsia="Consolas" w:hAnsi="Consolas"/>
-              </w:rPr>
-              <w:t xml:space="preserve">price</w:t>
-            </w:r>
-          </w:p>
-        </w:tc>
-        <w:tc>
-          <w:tcPr>
-            <w:tcW w:type="dxa" w:w="1872"/>
-            <w:tcMar>
-              <w:top w:type="dxa" w:w="40"/>
-              <w:left w:type="dxa" w:w="80"/>
-              <w:bottom w:type="dxa" w:w="40"/>
-              <w:right w:type="dxa" w:w="80"/>
-            </w:tcMar>
-          </w:tcPr>
-          <w:p>
-            <w:r>
-              <w:t xml:space="preserve">int (kobo)?</w:t>
-            </w:r>
-          </w:p>
-        </w:tc>
-        <w:tc>
-          <w:tcPr>
-            <w:tcW w:type="dxa" w:w="1872"/>
-            <w:tcMar>
-              <w:top w:type="dxa" w:w="40"/>
-              <w:left w:type="dxa" w:w="80"/>
-              <w:bottom w:type="dxa" w:w="40"/>
-              <w:right w:type="dxa" w:w="80"/>
-            </w:tcMar>
-          </w:tcPr>
-          <w:p>
-            <w:r>
-              <w:t xml:space="preserve">0/absent = free with portal access</w:t>
-            </w:r>
-          </w:p>
-        </w:tc>
-        <w:tc>
-          <w:tcPr>
-            <w:tcW w:type="dxa" w:w="1872"/>
-            <w:tcMar>
-              <w:top w:type="dxa" w:w="40"/>
-              <w:left w:type="dxa" w:w="80"/>
-              <w:bottom w:type="dxa" w:w="40"/>
-              <w:right w:type="dxa" w:w="80"/>
-            </w:tcMar>
-          </w:tcPr>
-          <w:p>
-            <w:r>
-              <w:t xml:space="preserve"/>
-            </w:r>
-          </w:p>
-        </w:tc>
-        <w:tc>
-          <w:tcPr>
-            <w:tcW w:type="dxa" w:w="1872"/>
+            <w:tcW w:type="dxa" w:w="3120"/>
+            <w:tcMar>
+              <w:top w:type="dxa" w:w="40"/>
+              <w:left w:type="dxa" w:w="80"/>
+              <w:bottom w:type="dxa" w:w="40"/>
+              <w:right w:type="dxa" w:w="80"/>
+            </w:tcMar>
+          </w:tcPr>
+          <w:p>
+            <w:r>
+              <w:rPr>
+                <w:rFonts w:ascii="Consolas" w:cs="Consolas" w:eastAsia="Consolas" w:hAnsi="Consolas"/>
+              </w:rPr>
+              <w:t xml:space="preserve">isPublished</w:t>
+            </w:r>
+          </w:p>
+        </w:tc>
+        <w:tc>
+          <w:tcPr>
+            <w:tcW w:type="dxa" w:w="3120"/>
+            <w:tcMar>
+              <w:top w:type="dxa" w:w="40"/>
+              <w:left w:type="dxa" w:w="80"/>
+              <w:bottom w:type="dxa" w:w="40"/>
+              <w:right w:type="dxa" w:w="80"/>
+            </w:tcMar>
+          </w:tcPr>
+          <w:p>
+            <w:r>
+              <w:t xml:space="preserve">bool</w:t>
+            </w:r>
+          </w:p>
+        </w:tc>
+        <w:tc>
+          <w:tcPr>
+            <w:tcW w:type="dxa" w:w="3120"/>
             <w:tcMar>
               <w:top w:type="dxa" w:w="40"/>
               <w:left w:type="dxa" w:w="80"/>
@@ -5235,183 +4944,7 @@
         </w:trPr>
         <w:tc>
           <w:tcPr>
-            <w:tcW w:type="dxa" w:w="1872"/>
-            <w:tcMar>
-              <w:top w:type="dxa" w:w="40"/>
-              <w:left w:type="dxa" w:w="80"/>
-              <w:bottom w:type="dxa" w:w="40"/>
-              <w:right w:type="dxa" w:w="80"/>
-            </w:tcMar>
-          </w:tcPr>
-          <w:p>
-            <w:r>
-              <w:rPr>
-                <w:rFonts w:ascii="Consolas" w:cs="Consolas" w:eastAsia="Consolas" w:hAnsi="Consolas"/>
-              </w:rPr>
-              <w:t xml:space="preserve">isPublished</w:t>
-            </w:r>
-          </w:p>
-        </w:tc>
-        <w:tc>
-          <w:tcPr>
-            <w:tcW w:type="dxa" w:w="1872"/>
-            <w:tcMar>
-              <w:top w:type="dxa" w:w="40"/>
-              <w:left w:type="dxa" w:w="80"/>
-              <w:bottom w:type="dxa" w:w="40"/>
-              <w:right w:type="dxa" w:w="80"/>
-            </w:tcMar>
-          </w:tcPr>
-          <w:p>
-            <w:r>
-              <w:t xml:space="preserve">bool</w:t>
-            </w:r>
-          </w:p>
-        </w:tc>
-        <w:tc>
-          <w:tcPr>
-            <w:tcW w:type="dxa" w:w="1872"/>
-            <w:tcMar>
-              <w:top w:type="dxa" w:w="40"/>
-              <w:left w:type="dxa" w:w="80"/>
-              <w:bottom w:type="dxa" w:w="40"/>
-              <w:right w:type="dxa" w:w="80"/>
-            </w:tcMar>
-          </w:tcPr>
-          <w:p>
-            <w:r>
-              <w:t xml:space="preserve"/>
-            </w:r>
-          </w:p>
-        </w:tc>
-        <w:tc>
-          <w:tcPr>
-            <w:tcW w:type="dxa" w:w="1872"/>
-            <w:tcMar>
-              <w:top w:type="dxa" w:w="40"/>
-              <w:left w:type="dxa" w:w="80"/>
-              <w:bottom w:type="dxa" w:w="40"/>
-              <w:right w:type="dxa" w:w="80"/>
-            </w:tcMar>
-          </w:tcPr>
-          <w:p>
-            <w:r>
-              <w:t xml:space="preserve"/>
-            </w:r>
-          </w:p>
-        </w:tc>
-        <w:tc>
-          <w:tcPr>
-            <w:tcW w:type="dxa" w:w="1872"/>
-            <w:tcMar>
-              <w:top w:type="dxa" w:w="40"/>
-              <w:left w:type="dxa" w:w="80"/>
-              <w:bottom w:type="dxa" w:w="40"/>
-              <w:right w:type="dxa" w:w="80"/>
-            </w:tcMar>
-          </w:tcPr>
-          <w:p>
-            <w:r>
-              <w:t xml:space="preserve"/>
-            </w:r>
-          </w:p>
-        </w:tc>
-      </w:tr>
-      <w:tr>
-        <w:trPr>
-          <w:tblHeader w:val="false"/>
-        </w:trPr>
-        <w:tc>
-          <w:tcPr>
-            <w:tcW w:type="dxa" w:w="1872"/>
-            <w:tcMar>
-              <w:top w:type="dxa" w:w="40"/>
-              <w:left w:type="dxa" w:w="80"/>
-              <w:bottom w:type="dxa" w:w="40"/>
-              <w:right w:type="dxa" w:w="80"/>
-            </w:tcMar>
-          </w:tcPr>
-          <w:p>
-            <w:r>
-              <w:rPr>
-                <w:rFonts w:ascii="Consolas" w:cs="Consolas" w:eastAsia="Consolas" w:hAnsi="Consolas"/>
-              </w:rPr>
-              <w:t xml:space="preserve">syllabusMaterialId</w:t>
-            </w:r>
-          </w:p>
-        </w:tc>
-        <w:tc>
-          <w:tcPr>
-            <w:tcW w:type="dxa" w:w="1872"/>
-            <w:tcMar>
-              <w:top w:type="dxa" w:w="40"/>
-              <w:left w:type="dxa" w:w="80"/>
-              <w:bottom w:type="dxa" w:w="40"/>
-              <w:right w:type="dxa" w:w="80"/>
-            </w:tcMar>
-          </w:tcPr>
-          <w:p>
-            <w:r>
-              <w:t xml:space="preserve">FK→CourseMaterial?</w:t>
-            </w:r>
-          </w:p>
-        </w:tc>
-        <w:tc>
-          <w:tcPr>
-            <w:tcW w:type="dxa" w:w="1872"/>
-            <w:tcMar>
-              <w:top w:type="dxa" w:w="40"/>
-              <w:left w:type="dxa" w:w="80"/>
-              <w:bottom w:type="dxa" w:w="40"/>
-              <w:right w:type="dxa" w:w="80"/>
-            </w:tcMar>
-          </w:tcPr>
-          <w:p>
-            <w:r>
-              <w:t xml:space="preserve">the syllabus doc</w:t>
-            </w:r>
-          </w:p>
-        </w:tc>
-        <w:tc>
-          <w:tcPr>
-            <w:tcW w:type="dxa" w:w="1872"/>
-            <w:tcMar>
-              <w:top w:type="dxa" w:w="40"/>
-              <w:left w:type="dxa" w:w="80"/>
-              <w:bottom w:type="dxa" w:w="40"/>
-              <w:right w:type="dxa" w:w="80"/>
-            </w:tcMar>
-          </w:tcPr>
-          <w:p>
-            <w:r>
-              <w:t xml:space="preserve"/>
-            </w:r>
-          </w:p>
-        </w:tc>
-        <w:tc>
-          <w:tcPr>
-            <w:tcW w:type="dxa" w:w="1872"/>
-            <w:tcMar>
-              <w:top w:type="dxa" w:w="40"/>
-              <w:left w:type="dxa" w:w="80"/>
-              <w:bottom w:type="dxa" w:w="40"/>
-              <w:right w:type="dxa" w:w="80"/>
-            </w:tcMar>
-          </w:tcPr>
-          <w:p>
-            <w:r>
-              <w:t xml:space="preserve"/>
-            </w:r>
-          </w:p>
-        </w:tc>
-      </w:tr>
-      <w:tr>
-        <w:trPr>
-          <w:tblHeader w:val="false"/>
-        </w:trPr>
-        <w:tc>
-          <w:tcPr>
-            <w:tcW w:type="dxa" w:w="1872"/>
+            <w:tcW w:type="dxa" w:w="3120"/>
             <w:tcMar>
               <w:top w:type="dxa" w:w="40"/>
               <w:left w:type="dxa" w:w="80"/>
@@ -5439,7 +4972,7 @@
         </w:tc>
         <w:tc>
           <w:tcPr>
-            <w:tcW w:type="dxa" w:w="1872"/>
+            <w:tcW w:type="dxa" w:w="3120"/>
             <w:tcMar>
               <w:top w:type="dxa" w:w="40"/>
               <w:left w:type="dxa" w:w="80"/>
@@ -5455,39 +4988,7 @@
         </w:tc>
         <w:tc>
           <w:tcPr>
-            <w:tcW w:type="dxa" w:w="1872"/>
-            <w:tcMar>
-              <w:top w:type="dxa" w:w="40"/>
-              <w:left w:type="dxa" w:w="80"/>
-              <w:bottom w:type="dxa" w:w="40"/>
-              <w:right w:type="dxa" w:w="80"/>
-            </w:tcMar>
-          </w:tcPr>
-          <w:p>
-            <w:r>
-              <w:t xml:space="preserve"/>
-            </w:r>
-          </w:p>
-        </w:tc>
-        <w:tc>
-          <w:tcPr>
-            <w:tcW w:type="dxa" w:w="1872"/>
-            <w:tcMar>
-              <w:top w:type="dxa" w:w="40"/>
-              <w:left w:type="dxa" w:w="80"/>
-              <w:bottom w:type="dxa" w:w="40"/>
-              <w:right w:type="dxa" w:w="80"/>
-            </w:tcMar>
-          </w:tcPr>
-          <w:p>
-            <w:r>
-              <w:t xml:space="preserve"/>
-            </w:r>
-          </w:p>
-        </w:tc>
-        <w:tc>
-          <w:tcPr>
-            <w:tcW w:type="dxa" w:w="1872"/>
+            <w:tcW w:type="dxa" w:w="3120"/>
             <w:tcMar>
               <w:top w:type="dxa" w:w="40"/>
               <w:left w:type="dxa" w:w="80"/>
@@ -5507,6 +5008,239 @@
       <w:pPr>
         <w:spacing w:after="80"/>
       </w:pPr>
+    </w:p>
+    <w:p>
+      <w:pPr>
+        <w:spacing w:after="100"/>
+        <w:ind w:left="360"/>
+      </w:pPr>
+      <w:r>
+        <w:rPr>
+          <w:b/>
+          <w:bCs/>
+          <w:i/>
+          <w:iCs/>
+          <w:color w:val="555555"/>
+        </w:rPr>
+        <w:t xml:space="preserve">Categories (as built).</w:t>
+      </w:r>
+      <w:r>
+        <w:rPr>
+          <w:i/>
+          <w:iCs/>
+          <w:color w:val="555555"/>
+        </w:rPr>
+        <w:t xml:space="preserve"> Courses are added by the </w:t>
+      </w:r>
+      <w:r>
+        <w:rPr>
+          <w:b/>
+          <w:bCs/>
+          <w:i/>
+          <w:iCs/>
+          <w:color w:val="555555"/>
+        </w:rPr>
+        <w:t xml:space="preserve">admin</w:t>
+      </w:r>
+      <w:r>
+        <w:rPr>
+          <w:i/>
+          <w:iCs/>
+          <w:color w:val="555555"/>
+        </w:rPr>
+        <w:t xml:space="preserve"> under one of the</w:t>
+      </w:r>
+    </w:p>
+    <w:p>
+      <w:pPr>
+        <w:spacing w:after="100"/>
+        <w:ind w:left="360"/>
+      </w:pPr>
+      <w:r>
+        <w:rPr>
+          <w:i/>
+          <w:iCs/>
+          <w:color w:val="555555"/>
+        </w:rPr>
+        <w:t xml:space="preserve">three categories above and </w:t>
+      </w:r>
+      <w:r>
+        <w:rPr>
+          <w:b/>
+          <w:bCs/>
+          <w:i/>
+          <w:iCs/>
+          <w:color w:val="555555"/>
+        </w:rPr>
+        <w:t xml:space="preserve">assigned to a tutor</w:t>
+      </w:r>
+      <w:r>
+        <w:rPr>
+          <w:i/>
+          <w:iCs/>
+          <w:color w:val="555555"/>
+        </w:rPr>
+        <w:t xml:space="preserve">. A student's category is</w:t>
+      </w:r>
+    </w:p>
+    <w:p>
+      <w:pPr>
+        <w:spacing w:after="100"/>
+        <w:ind w:left="360"/>
+      </w:pPr>
+      <w:r>
+        <w:rPr>
+          <w:i/>
+          <w:iCs/>
+          <w:color w:val="555555"/>
+        </w:rPr>
+        <w:t xml:space="preserve">derived from their track/level (WAEC &amp; SS → </w:t>
+      </w:r>
+      <w:r>
+        <w:rPr>
+          <w:rFonts w:ascii="Consolas" w:cs="Consolas" w:eastAsia="Consolas" w:hAnsi="Consolas"/>
+          <w:i/>
+          <w:iCs/>
+          <w:color w:val="555555"/>
+        </w:rPr>
+        <w:t xml:space="preserve">waec-sss</w:t>
+      </w:r>
+      <w:r>
+        <w:rPr>
+          <w:i/>
+          <w:iCs/>
+          <w:color w:val="555555"/>
+        </w:rPr>
+        <w:t xml:space="preserve">; JAMB &amp; Post-UTME →</w:t>
+      </w:r>
+    </w:p>
+    <w:p>
+      <w:pPr>
+        <w:spacing w:after="100"/>
+        <w:ind w:left="360"/>
+      </w:pPr>
+      <w:r>
+        <w:rPr>
+          <w:rFonts w:ascii="Consolas" w:cs="Consolas" w:eastAsia="Consolas" w:hAnsi="Consolas"/>
+          <w:i/>
+          <w:iCs/>
+          <w:color w:val="555555"/>
+        </w:rPr>
+        <w:t xml:space="preserve">jamb-putme</w:t>
+      </w:r>
+      <w:r>
+        <w:rPr>
+          <w:i/>
+          <w:iCs/>
+          <w:color w:val="555555"/>
+        </w:rPr>
+        <w:t xml:space="preserve">; 100/200 → </w:t>
+      </w:r>
+      <w:r>
+        <w:rPr>
+          <w:rFonts w:ascii="Consolas" w:cs="Consolas" w:eastAsia="Consolas" w:hAnsi="Consolas"/>
+          <w:i/>
+          <w:iCs/>
+          <w:color w:val="555555"/>
+        </w:rPr>
+        <w:t xml:space="preserve">higher</w:t>
+      </w:r>
+      <w:r>
+        <w:rPr>
+          <w:i/>
+          <w:iCs/>
+          <w:color w:val="555555"/>
+        </w:rPr>
+        <w:t xml:space="preserve">). </w:t>
+      </w:r>
+      <w:r>
+        <w:rPr>
+          <w:b/>
+          <w:bCs/>
+          <w:i/>
+          <w:iCs/>
+          <w:color w:val="555555"/>
+        </w:rPr>
+        <w:t xml:space="preserve">JAMB and Post-UTME see the same courses.</w:t>
+      </w:r>
+    </w:p>
+    <w:p>
+      <w:pPr>
+        <w:spacing w:after="100"/>
+        <w:ind w:left="360"/>
+      </w:pPr>
+      <w:r>
+        <w:rPr>
+          <w:i/>
+          <w:iCs/>
+          <w:color w:val="555555"/>
+        </w:rPr>
+        <w:t xml:space="preserve">Students see the courses </w:t>
+      </w:r>
+      <w:r>
+        <w:rPr>
+          <w:b/>
+          <w:bCs/>
+          <w:i/>
+          <w:iCs/>
+          <w:color w:val="555555"/>
+        </w:rPr>
+        <w:t xml:space="preserve">and the assigned tutor</w:t>
+      </w:r>
+      <w:r>
+        <w:rPr>
+          <w:i/>
+          <w:iCs/>
+          <w:color w:val="555555"/>
+        </w:rPr>
+        <w:t xml:space="preserve"> for their category; a tutor</w:t>
+      </w:r>
+    </w:p>
+    <w:p>
+      <w:pPr>
+        <w:spacing w:after="100"/>
+        <w:ind w:left="360"/>
+      </w:pPr>
+      <w:r>
+        <w:rPr>
+          <w:i/>
+          <w:iCs/>
+          <w:color w:val="555555"/>
+        </w:rPr>
+        <w:t xml:space="preserve">sees the </w:t>
+      </w:r>
+      <w:r>
+        <w:rPr>
+          <w:b/>
+          <w:bCs/>
+          <w:i/>
+          <w:iCs/>
+          <w:color w:val="555555"/>
+        </w:rPr>
+        <w:t xml:space="preserve">students doing their courses</w:t>
+      </w:r>
+      <w:r>
+        <w:rPr>
+          <w:i/>
+          <w:iCs/>
+          <w:color w:val="555555"/>
+        </w:rPr>
+        <w:t xml:space="preserve"> (students whose category matches a</w:t>
+      </w:r>
+    </w:p>
+    <w:p>
+      <w:pPr>
+        <w:spacing w:after="100"/>
+        <w:ind w:left="360"/>
+      </w:pPr>
+      <w:r>
+        <w:rPr>
+          <w:i/>
+          <w:iCs/>
+          <w:color w:val="555555"/>
+        </w:rPr>
+        <w:t xml:space="preserve">category of a course assigned to that tutor).</w:t>
+      </w:r>
     </w:p>
     <w:p>
       <w:pPr>
@@ -16223,7 +15957,7 @@
               <w:rPr>
                 <w:rFonts w:ascii="Consolas" w:cs="Consolas" w:eastAsia="Consolas" w:hAnsi="Consolas"/>
               </w:rPr>
-              <w:t xml:space="preserve">/courses</w:t>
+              <w:t xml:space="preserve">/courses?category=</w:t>
             </w:r>
           </w:p>
         </w:tc>
@@ -16255,13 +15989,22 @@
           </w:tcPr>
           <w:p>
             <w:r>
-              <w:t xml:space="preserve">list/browse (filter </w:t>
-            </w:r>
-            <w:r>
-              <w:rPr>
-                <w:rFonts w:ascii="Consolas" w:cs="Consolas" w:eastAsia="Consolas" w:hAnsi="Consolas"/>
-              </w:rPr>
-              <w:t xml:space="preserve">?track=&amp;department=&amp;tutorId=</w:t>
+              <w:t xml:space="preserve">list courses (filter by </w:t>
+            </w:r>
+            <w:r>
+              <w:rPr>
+                <w:rFonts w:ascii="Consolas" w:cs="Consolas" w:eastAsia="Consolas" w:hAnsi="Consolas"/>
+              </w:rPr>
+              <w:t xml:space="preserve">category</w:t>
+            </w:r>
+            <w:r>
+              <w:t xml:space="preserve"> / </w:t>
+            </w:r>
+            <w:r>
+              <w:rPr>
+                <w:rFonts w:ascii="Consolas" w:cs="Consolas" w:eastAsia="Consolas" w:hAnsi="Consolas"/>
+              </w:rPr>
+              <w:t xml:space="preserve">tutorId</w:t>
             </w:r>
             <w:r>
               <w:t xml:space="preserve">)</w:t>
@@ -16304,39 +16047,59 @@
               <w:rPr>
                 <w:rFonts w:ascii="Consolas" w:cs="Consolas" w:eastAsia="Consolas" w:hAnsi="Consolas"/>
               </w:rPr>
-              <w:t xml:space="preserve">/courses/:id</w:t>
-            </w:r>
-          </w:p>
-        </w:tc>
-        <w:tc>
-          <w:tcPr>
-            <w:tcW w:type="dxa" w:w="2340"/>
-            <w:tcMar>
-              <w:top w:type="dxa" w:w="40"/>
-              <w:left w:type="dxa" w:w="80"/>
-              <w:bottom w:type="dxa" w:w="40"/>
-              <w:right w:type="dxa" w:w="80"/>
-            </w:tcMar>
-          </w:tcPr>
-          <w:p>
-            <w:r>
-              <w:t xml:space="preserve">any</w:t>
-            </w:r>
-          </w:p>
-        </w:tc>
-        <w:tc>
-          <w:tcPr>
-            <w:tcW w:type="dxa" w:w="2340"/>
-            <w:tcMar>
-              <w:top w:type="dxa" w:w="40"/>
-              <w:left w:type="dxa" w:w="80"/>
-              <w:bottom w:type="dxa" w:w="40"/>
-              <w:right w:type="dxa" w:w="80"/>
-            </w:tcMar>
-          </w:tcPr>
-          <w:p>
-            <w:r>
-              <w:t xml:space="preserve">course detail (+materials/assignments counts)</w:t>
+              <w:t xml:space="preserve">/courses/mine</w:t>
+            </w:r>
+          </w:p>
+        </w:tc>
+        <w:tc>
+          <w:tcPr>
+            <w:tcW w:type="dxa" w:w="2340"/>
+            <w:tcMar>
+              <w:top w:type="dxa" w:w="40"/>
+              <w:left w:type="dxa" w:w="80"/>
+              <w:bottom w:type="dxa" w:w="40"/>
+              <w:right w:type="dxa" w:w="80"/>
+            </w:tcMar>
+          </w:tcPr>
+          <w:p>
+            <w:r>
+              <w:t xml:space="preserve">student</w:t>
+            </w:r>
+          </w:p>
+        </w:tc>
+        <w:tc>
+          <w:tcPr>
+            <w:tcW w:type="dxa" w:w="2340"/>
+            <w:tcMar>
+              <w:top w:type="dxa" w:w="40"/>
+              <w:left w:type="dxa" w:w="80"/>
+              <w:bottom w:type="dxa" w:w="40"/>
+              <w:right w:type="dxa" w:w="80"/>
+            </w:tcMar>
+          </w:tcPr>
+          <w:p>
+            <w:r>
+              <w:t xml:space="preserve">courses </w:t>
+            </w:r>
+            <w:r>
+              <w:rPr>
+                <w:b/>
+                <w:bCs/>
+              </w:rPr>
+              <w:t xml:space="preserve">for the student's category</w:t>
+            </w:r>
+            <w:r>
+              <w:t xml:space="preserve"> + each course's assigned </w:t>
+            </w:r>
+            <w:r>
+              <w:rPr>
+                <w:b/>
+                <w:bCs/>
+              </w:rPr>
+              <w:t xml:space="preserve">tutor</w:t>
+            </w:r>
+            <w:r>
+              <w:t xml:space="preserve"> (drives "My Courses / Your Tutors")</w:t>
             </w:r>
           </w:p>
         </w:tc>
@@ -16357,58 +16120,58 @@
           </w:tcPr>
           <w:p>
             <w:r>
-              <w:t xml:space="preserve">POST</w:t>
-            </w:r>
-          </w:p>
-        </w:tc>
-        <w:tc>
-          <w:tcPr>
-            <w:tcW w:type="dxa" w:w="2340"/>
-            <w:tcMar>
-              <w:top w:type="dxa" w:w="40"/>
-              <w:left w:type="dxa" w:w="80"/>
-              <w:bottom w:type="dxa" w:w="40"/>
-              <w:right w:type="dxa" w:w="80"/>
-            </w:tcMar>
-          </w:tcPr>
-          <w:p>
-            <w:r>
-              <w:rPr>
-                <w:rFonts w:ascii="Consolas" w:cs="Consolas" w:eastAsia="Consolas" w:hAnsi="Consolas"/>
-              </w:rPr>
-              <w:t xml:space="preserve">/courses</w:t>
-            </w:r>
-          </w:p>
-        </w:tc>
-        <w:tc>
-          <w:tcPr>
-            <w:tcW w:type="dxa" w:w="2340"/>
-            <w:tcMar>
-              <w:top w:type="dxa" w:w="40"/>
-              <w:left w:type="dxa" w:w="80"/>
-              <w:bottom w:type="dxa" w:w="40"/>
-              <w:right w:type="dxa" w:w="80"/>
-            </w:tcMar>
-          </w:tcPr>
-          <w:p>
-            <w:r>
-              <w:t xml:space="preserve">tutor/admin</w:t>
-            </w:r>
-          </w:p>
-        </w:tc>
-        <w:tc>
-          <w:tcPr>
-            <w:tcW w:type="dxa" w:w="2340"/>
-            <w:tcMar>
-              <w:top w:type="dxa" w:w="40"/>
-              <w:left w:type="dxa" w:w="80"/>
-              <w:bottom w:type="dxa" w:w="40"/>
-              <w:right w:type="dxa" w:w="80"/>
-            </w:tcMar>
-          </w:tcPr>
-          <w:p>
-            <w:r>
-              <w:t xml:space="preserve">create</w:t>
+              <w:t xml:space="preserve">GET</w:t>
+            </w:r>
+          </w:p>
+        </w:tc>
+        <w:tc>
+          <w:tcPr>
+            <w:tcW w:type="dxa" w:w="2340"/>
+            <w:tcMar>
+              <w:top w:type="dxa" w:w="40"/>
+              <w:left w:type="dxa" w:w="80"/>
+              <w:bottom w:type="dxa" w:w="40"/>
+              <w:right w:type="dxa" w:w="80"/>
+            </w:tcMar>
+          </w:tcPr>
+          <w:p>
+            <w:r>
+              <w:rPr>
+                <w:rFonts w:ascii="Consolas" w:cs="Consolas" w:eastAsia="Consolas" w:hAnsi="Consolas"/>
+              </w:rPr>
+              <w:t xml:space="preserve">/courses/:id</w:t>
+            </w:r>
+          </w:p>
+        </w:tc>
+        <w:tc>
+          <w:tcPr>
+            <w:tcW w:type="dxa" w:w="2340"/>
+            <w:tcMar>
+              <w:top w:type="dxa" w:w="40"/>
+              <w:left w:type="dxa" w:w="80"/>
+              <w:bottom w:type="dxa" w:w="40"/>
+              <w:right w:type="dxa" w:w="80"/>
+            </w:tcMar>
+          </w:tcPr>
+          <w:p>
+            <w:r>
+              <w:t xml:space="preserve">any</w:t>
+            </w:r>
+          </w:p>
+        </w:tc>
+        <w:tc>
+          <w:tcPr>
+            <w:tcW w:type="dxa" w:w="2340"/>
+            <w:tcMar>
+              <w:top w:type="dxa" w:w="40"/>
+              <w:left w:type="dxa" w:w="80"/>
+              <w:bottom w:type="dxa" w:w="40"/>
+              <w:right w:type="dxa" w:w="80"/>
+            </w:tcMar>
+          </w:tcPr>
+          <w:p>
+            <w:r>
+              <w:t xml:space="preserve">course detail (+materials/assignments counts)</w:t>
             </w:r>
           </w:p>
         </w:tc>
@@ -16429,58 +16192,68 @@
           </w:tcPr>
           <w:p>
             <w:r>
-              <w:t xml:space="preserve">PUT</w:t>
-            </w:r>
-          </w:p>
-        </w:tc>
-        <w:tc>
-          <w:tcPr>
-            <w:tcW w:type="dxa" w:w="2340"/>
-            <w:tcMar>
-              <w:top w:type="dxa" w:w="40"/>
-              <w:left w:type="dxa" w:w="80"/>
-              <w:bottom w:type="dxa" w:w="40"/>
-              <w:right w:type="dxa" w:w="80"/>
-            </w:tcMar>
-          </w:tcPr>
-          <w:p>
-            <w:r>
-              <w:rPr>
-                <w:rFonts w:ascii="Consolas" w:cs="Consolas" w:eastAsia="Consolas" w:hAnsi="Consolas"/>
-              </w:rPr>
-              <w:t xml:space="preserve">/courses/:id</w:t>
-            </w:r>
-          </w:p>
-        </w:tc>
-        <w:tc>
-          <w:tcPr>
-            <w:tcW w:type="dxa" w:w="2340"/>
-            <w:tcMar>
-              <w:top w:type="dxa" w:w="40"/>
-              <w:left w:type="dxa" w:w="80"/>
-              <w:bottom w:type="dxa" w:w="40"/>
-              <w:right w:type="dxa" w:w="80"/>
-            </w:tcMar>
-          </w:tcPr>
-          <w:p>
-            <w:r>
-              <w:t xml:space="preserve">owner tutor/admin</w:t>
-            </w:r>
-          </w:p>
-        </w:tc>
-        <w:tc>
-          <w:tcPr>
-            <w:tcW w:type="dxa" w:w="2340"/>
-            <w:tcMar>
-              <w:top w:type="dxa" w:w="40"/>
-              <w:left w:type="dxa" w:w="80"/>
-              <w:bottom w:type="dxa" w:w="40"/>
-              <w:right w:type="dxa" w:w="80"/>
-            </w:tcMar>
-          </w:tcPr>
-          <w:p>
-            <w:r>
-              <w:t xml:space="preserve">update</w:t>
+              <w:t xml:space="preserve">POST</w:t>
+            </w:r>
+          </w:p>
+        </w:tc>
+        <w:tc>
+          <w:tcPr>
+            <w:tcW w:type="dxa" w:w="2340"/>
+            <w:tcMar>
+              <w:top w:type="dxa" w:w="40"/>
+              <w:left w:type="dxa" w:w="80"/>
+              <w:bottom w:type="dxa" w:w="40"/>
+              <w:right w:type="dxa" w:w="80"/>
+            </w:tcMar>
+          </w:tcPr>
+          <w:p>
+            <w:r>
+              <w:rPr>
+                <w:rFonts w:ascii="Consolas" w:cs="Consolas" w:eastAsia="Consolas" w:hAnsi="Consolas"/>
+              </w:rPr>
+              <w:t xml:space="preserve">/courses</w:t>
+            </w:r>
+          </w:p>
+        </w:tc>
+        <w:tc>
+          <w:tcPr>
+            <w:tcW w:type="dxa" w:w="2340"/>
+            <w:tcMar>
+              <w:top w:type="dxa" w:w="40"/>
+              <w:left w:type="dxa" w:w="80"/>
+              <w:bottom w:type="dxa" w:w="40"/>
+              <w:right w:type="dxa" w:w="80"/>
+            </w:tcMar>
+          </w:tcPr>
+          <w:p>
+            <w:r>
+              <w:rPr>
+                <w:b/>
+                <w:bCs/>
+              </w:rPr>
+              <w:t xml:space="preserve">admin</w:t>
+            </w:r>
+          </w:p>
+        </w:tc>
+        <w:tc>
+          <w:tcPr>
+            <w:tcW w:type="dxa" w:w="2340"/>
+            <w:tcMar>
+              <w:top w:type="dxa" w:w="40"/>
+              <w:left w:type="dxa" w:w="80"/>
+              <w:bottom w:type="dxa" w:w="40"/>
+              <w:right w:type="dxa" w:w="80"/>
+            </w:tcMar>
+          </w:tcPr>
+          <w:p>
+            <w:r>
+              <w:t xml:space="preserve">create — </w:t>
+            </w:r>
+            <w:r>
+              <w:rPr>
+                <w:rFonts w:ascii="Consolas" w:cs="Consolas" w:eastAsia="Consolas" w:hAnsi="Consolas"/>
+              </w:rPr>
+              <w:t xml:space="preserve">{ title, subject, category, tutorId? }</w:t>
             </w:r>
           </w:p>
         </w:tc>
@@ -16501,7 +16274,7 @@
           </w:tcPr>
           <w:p>
             <w:r>
-              <w:t xml:space="preserve">DELETE</w:t>
+              <w:t xml:space="preserve">PUT</w:t>
             </w:r>
           </w:p>
         </w:tc>
@@ -16536,23 +16309,42 @@
           </w:tcPr>
           <w:p>
             <w:r>
-              <w:t xml:space="preserve">owner tutor/admin</w:t>
-            </w:r>
-          </w:p>
-        </w:tc>
-        <w:tc>
-          <w:tcPr>
-            <w:tcW w:type="dxa" w:w="2340"/>
-            <w:tcMar>
-              <w:top w:type="dxa" w:w="40"/>
-              <w:left w:type="dxa" w:w="80"/>
-              <w:bottom w:type="dxa" w:w="40"/>
-              <w:right w:type="dxa" w:w="80"/>
-            </w:tcMar>
-          </w:tcPr>
-          <w:p>
-            <w:r>
-              <w:t xml:space="preserve"/>
+              <w:t xml:space="preserve">admin</w:t>
+            </w:r>
+          </w:p>
+        </w:tc>
+        <w:tc>
+          <w:tcPr>
+            <w:tcW w:type="dxa" w:w="2340"/>
+            <w:tcMar>
+              <w:top w:type="dxa" w:w="40"/>
+              <w:left w:type="dxa" w:w="80"/>
+              <w:bottom w:type="dxa" w:w="40"/>
+              <w:right w:type="dxa" w:w="80"/>
+            </w:tcMar>
+          </w:tcPr>
+          <w:p>
+            <w:r>
+              <w:t xml:space="preserve">update / </w:t>
+            </w:r>
+            <w:r>
+              <w:rPr>
+                <w:b/>
+                <w:bCs/>
+              </w:rPr>
+              <w:t xml:space="preserve">assign or change the tutor</w:t>
+            </w:r>
+            <w:r>
+              <w:t xml:space="preserve"> (</w:t>
+            </w:r>
+            <w:r>
+              <w:rPr>
+                <w:rFonts w:ascii="Consolas" w:cs="Consolas" w:eastAsia="Consolas" w:hAnsi="Consolas"/>
+              </w:rPr>
+              <w:t xml:space="preserve">tutorId</w:t>
+            </w:r>
+            <w:r>
+              <w:t xml:space="preserve">)</w:t>
             </w:r>
           </w:p>
         </w:tc>
@@ -16573,58 +16365,58 @@
           </w:tcPr>
           <w:p>
             <w:r>
-              <w:t xml:space="preserve">POST</w:t>
-            </w:r>
-          </w:p>
-        </w:tc>
-        <w:tc>
-          <w:tcPr>
-            <w:tcW w:type="dxa" w:w="2340"/>
-            <w:tcMar>
-              <w:top w:type="dxa" w:w="40"/>
-              <w:left w:type="dxa" w:w="80"/>
-              <w:bottom w:type="dxa" w:w="40"/>
-              <w:right w:type="dxa" w:w="80"/>
-            </w:tcMar>
-          </w:tcPr>
-          <w:p>
-            <w:r>
-              <w:rPr>
-                <w:rFonts w:ascii="Consolas" w:cs="Consolas" w:eastAsia="Consolas" w:hAnsi="Consolas"/>
-              </w:rPr>
-              <w:t xml:space="preserve">/courses/:id/enroll</w:t>
-            </w:r>
-          </w:p>
-        </w:tc>
-        <w:tc>
-          <w:tcPr>
-            <w:tcW w:type="dxa" w:w="2340"/>
-            <w:tcMar>
-              <w:top w:type="dxa" w:w="40"/>
-              <w:left w:type="dxa" w:w="80"/>
-              <w:bottom w:type="dxa" w:w="40"/>
-              <w:right w:type="dxa" w:w="80"/>
-            </w:tcMar>
-          </w:tcPr>
-          <w:p>
-            <w:r>
-              <w:t xml:space="preserve">student</w:t>
-            </w:r>
-          </w:p>
-        </w:tc>
-        <w:tc>
-          <w:tcPr>
-            <w:tcW w:type="dxa" w:w="2340"/>
-            <w:tcMar>
-              <w:top w:type="dxa" w:w="40"/>
-              <w:left w:type="dxa" w:w="80"/>
-              <w:bottom w:type="dxa" w:w="40"/>
-              <w:right w:type="dxa" w:w="80"/>
-            </w:tcMar>
-          </w:tcPr>
-          <w:p>
-            <w:r>
-              <w:t xml:space="preserve">enroll (→409 if already)</w:t>
+              <w:t xml:space="preserve">DELETE</w:t>
+            </w:r>
+          </w:p>
+        </w:tc>
+        <w:tc>
+          <w:tcPr>
+            <w:tcW w:type="dxa" w:w="2340"/>
+            <w:tcMar>
+              <w:top w:type="dxa" w:w="40"/>
+              <w:left w:type="dxa" w:w="80"/>
+              <w:bottom w:type="dxa" w:w="40"/>
+              <w:right w:type="dxa" w:w="80"/>
+            </w:tcMar>
+          </w:tcPr>
+          <w:p>
+            <w:r>
+              <w:rPr>
+                <w:rFonts w:ascii="Consolas" w:cs="Consolas" w:eastAsia="Consolas" w:hAnsi="Consolas"/>
+              </w:rPr>
+              <w:t xml:space="preserve">/courses/:id</w:t>
+            </w:r>
+          </w:p>
+        </w:tc>
+        <w:tc>
+          <w:tcPr>
+            <w:tcW w:type="dxa" w:w="2340"/>
+            <w:tcMar>
+              <w:top w:type="dxa" w:w="40"/>
+              <w:left w:type="dxa" w:w="80"/>
+              <w:bottom w:type="dxa" w:w="40"/>
+              <w:right w:type="dxa" w:w="80"/>
+            </w:tcMar>
+          </w:tcPr>
+          <w:p>
+            <w:r>
+              <w:t xml:space="preserve">admin</w:t>
+            </w:r>
+          </w:p>
+        </w:tc>
+        <w:tc>
+          <w:tcPr>
+            <w:tcW w:type="dxa" w:w="2340"/>
+            <w:tcMar>
+              <w:top w:type="dxa" w:w="40"/>
+              <w:left w:type="dxa" w:w="80"/>
+              <w:bottom w:type="dxa" w:w="40"/>
+              <w:right w:type="dxa" w:w="80"/>
+            </w:tcMar>
+          </w:tcPr>
+          <w:p>
+            <w:r>
+              <w:t xml:space="preserve"/>
             </w:r>
           </w:p>
         </w:tc>
@@ -16664,39 +16456,49 @@
               <w:rPr>
                 <w:rFonts w:ascii="Consolas" w:cs="Consolas" w:eastAsia="Consolas" w:hAnsi="Consolas"/>
               </w:rPr>
-              <w:t xml:space="preserve">/enrollments/me</w:t>
-            </w:r>
-          </w:p>
-        </w:tc>
-        <w:tc>
-          <w:tcPr>
-            <w:tcW w:type="dxa" w:w="2340"/>
-            <w:tcMar>
-              <w:top w:type="dxa" w:w="40"/>
-              <w:left w:type="dxa" w:w="80"/>
-              <w:bottom w:type="dxa" w:w="40"/>
-              <w:right w:type="dxa" w:w="80"/>
-            </w:tcMar>
-          </w:tcPr>
-          <w:p>
-            <w:r>
-              <w:t xml:space="preserve">student</w:t>
-            </w:r>
-          </w:p>
-        </w:tc>
-        <w:tc>
-          <w:tcPr>
-            <w:tcW w:type="dxa" w:w="2340"/>
-            <w:tcMar>
-              <w:top w:type="dxa" w:w="40"/>
-              <w:left w:type="dxa" w:w="80"/>
-              <w:bottom w:type="dxa" w:w="40"/>
-              <w:right w:type="dxa" w:w="80"/>
-            </w:tcMar>
-          </w:tcPr>
-          <w:p>
-            <w:r>
-              <w:t xml:space="preserve">my courses + progressPercent</w:t>
+              <w:t xml:space="preserve">/tutors/me/students</w:t>
+            </w:r>
+          </w:p>
+        </w:tc>
+        <w:tc>
+          <w:tcPr>
+            <w:tcW w:type="dxa" w:w="2340"/>
+            <w:tcMar>
+              <w:top w:type="dxa" w:w="40"/>
+              <w:left w:type="dxa" w:w="80"/>
+              <w:bottom w:type="dxa" w:w="40"/>
+              <w:right w:type="dxa" w:w="80"/>
+            </w:tcMar>
+          </w:tcPr>
+          <w:p>
+            <w:r>
+              <w:t xml:space="preserve">tutor</w:t>
+            </w:r>
+          </w:p>
+        </w:tc>
+        <w:tc>
+          <w:tcPr>
+            <w:tcW w:type="dxa" w:w="2340"/>
+            <w:tcMar>
+              <w:top w:type="dxa" w:w="40"/>
+              <w:left w:type="dxa" w:w="80"/>
+              <w:bottom w:type="dxa" w:w="40"/>
+              <w:right w:type="dxa" w:w="80"/>
+            </w:tcMar>
+          </w:tcPr>
+          <w:p>
+            <w:r>
+              <w:t xml:space="preserve">students </w:t>
+            </w:r>
+            <w:r>
+              <w:rPr>
+                <w:b/>
+                <w:bCs/>
+              </w:rPr>
+              <w:t xml:space="preserve">doing this tutor's courses</w:t>
+            </w:r>
+            <w:r>
+              <w:t xml:space="preserve"> — i.e. students whose category matches a category of a course assigned to the tutor</w:t>
             </w:r>
           </w:p>
         </w:tc>
@@ -16717,6 +16519,78 @@
           </w:tcPr>
           <w:p>
             <w:r>
+              <w:t xml:space="preserve">POST</w:t>
+            </w:r>
+          </w:p>
+        </w:tc>
+        <w:tc>
+          <w:tcPr>
+            <w:tcW w:type="dxa" w:w="2340"/>
+            <w:tcMar>
+              <w:top w:type="dxa" w:w="40"/>
+              <w:left w:type="dxa" w:w="80"/>
+              <w:bottom w:type="dxa" w:w="40"/>
+              <w:right w:type="dxa" w:w="80"/>
+            </w:tcMar>
+          </w:tcPr>
+          <w:p>
+            <w:r>
+              <w:rPr>
+                <w:rFonts w:ascii="Consolas" w:cs="Consolas" w:eastAsia="Consolas" w:hAnsi="Consolas"/>
+              </w:rPr>
+              <w:t xml:space="preserve">/courses/:id/enroll</w:t>
+            </w:r>
+          </w:p>
+        </w:tc>
+        <w:tc>
+          <w:tcPr>
+            <w:tcW w:type="dxa" w:w="2340"/>
+            <w:tcMar>
+              <w:top w:type="dxa" w:w="40"/>
+              <w:left w:type="dxa" w:w="80"/>
+              <w:bottom w:type="dxa" w:w="40"/>
+              <w:right w:type="dxa" w:w="80"/>
+            </w:tcMar>
+          </w:tcPr>
+          <w:p>
+            <w:r>
+              <w:t xml:space="preserve">student</w:t>
+            </w:r>
+          </w:p>
+        </w:tc>
+        <w:tc>
+          <w:tcPr>
+            <w:tcW w:type="dxa" w:w="2340"/>
+            <w:tcMar>
+              <w:top w:type="dxa" w:w="40"/>
+              <w:left w:type="dxa" w:w="80"/>
+              <w:bottom w:type="dxa" w:w="40"/>
+              <w:right w:type="dxa" w:w="80"/>
+            </w:tcMar>
+          </w:tcPr>
+          <w:p>
+            <w:r>
+              <w:t xml:space="preserve">(optional) explicit enroll — otherwise category drives membership</w:t>
+            </w:r>
+          </w:p>
+        </w:tc>
+      </w:tr>
+      <w:tr>
+        <w:trPr>
+          <w:tblHeader w:val="false"/>
+        </w:trPr>
+        <w:tc>
+          <w:tcPr>
+            <w:tcW w:type="dxa" w:w="2340"/>
+            <w:tcMar>
+              <w:top w:type="dxa" w:w="40"/>
+              <w:left w:type="dxa" w:w="80"/>
+              <w:bottom w:type="dxa" w:w="40"/>
+              <w:right w:type="dxa" w:w="80"/>
+            </w:tcMar>
+          </w:tcPr>
+          <w:p>
+            <w:r>
               <w:t xml:space="preserve">GET</w:t>
             </w:r>
           </w:p>
@@ -16736,39 +16610,39 @@
               <w:rPr>
                 <w:rFonts w:ascii="Consolas" w:cs="Consolas" w:eastAsia="Consolas" w:hAnsi="Consolas"/>
               </w:rPr>
-              <w:t xml:space="preserve">/courses/:id/students</w:t>
-            </w:r>
-          </w:p>
-        </w:tc>
-        <w:tc>
-          <w:tcPr>
-            <w:tcW w:type="dxa" w:w="2340"/>
-            <w:tcMar>
-              <w:top w:type="dxa" w:w="40"/>
-              <w:left w:type="dxa" w:w="80"/>
-              <w:bottom w:type="dxa" w:w="40"/>
-              <w:right w:type="dxa" w:w="80"/>
-            </w:tcMar>
-          </w:tcPr>
-          <w:p>
-            <w:r>
-              <w:t xml:space="preserve">owner tutor</w:t>
-            </w:r>
-          </w:p>
-        </w:tc>
-        <w:tc>
-          <w:tcPr>
-            <w:tcW w:type="dxa" w:w="2340"/>
-            <w:tcMar>
-              <w:top w:type="dxa" w:w="40"/>
-              <w:left w:type="dxa" w:w="80"/>
-              <w:bottom w:type="dxa" w:w="40"/>
-              <w:right w:type="dxa" w:w="80"/>
-            </w:tcMar>
-          </w:tcPr>
-          <w:p>
-            <w:r>
-              <w:t xml:space="preserve">roster</w:t>
+              <w:t xml:space="preserve">/enrollments/me</w:t>
+            </w:r>
+          </w:p>
+        </w:tc>
+        <w:tc>
+          <w:tcPr>
+            <w:tcW w:type="dxa" w:w="2340"/>
+            <w:tcMar>
+              <w:top w:type="dxa" w:w="40"/>
+              <w:left w:type="dxa" w:w="80"/>
+              <w:bottom w:type="dxa" w:w="40"/>
+              <w:right w:type="dxa" w:w="80"/>
+            </w:tcMar>
+          </w:tcPr>
+          <w:p>
+            <w:r>
+              <w:t xml:space="preserve">student</w:t>
+            </w:r>
+          </w:p>
+        </w:tc>
+        <w:tc>
+          <w:tcPr>
+            <w:tcW w:type="dxa" w:w="2340"/>
+            <w:tcMar>
+              <w:top w:type="dxa" w:w="40"/>
+              <w:left w:type="dxa" w:w="80"/>
+              <w:bottom w:type="dxa" w:w="40"/>
+              <w:right w:type="dxa" w:w="80"/>
+            </w:tcMar>
+          </w:tcPr>
+          <w:p>
+            <w:r>
+              <w:t xml:space="preserve">my courses + progressPercent</w:t>
             </w:r>
           </w:p>
         </w:tc>
@@ -16778,6 +16652,90 @@
       <w:pPr>
         <w:spacing w:after="80"/>
       </w:pPr>
+    </w:p>
+    <w:p>
+      <w:pPr>
+        <w:spacing w:after="100"/>
+        <w:ind w:left="360"/>
+      </w:pPr>
+      <w:r>
+        <w:rPr>
+          <w:i/>
+          <w:iCs/>
+          <w:color w:val="555555"/>
+        </w:rPr>
+        <w:t xml:space="preserve">Course management (add course + category + tutor assignment) is done by the</w:t>
+      </w:r>
+    </w:p>
+    <w:p>
+      <w:pPr>
+        <w:spacing w:after="100"/>
+        <w:ind w:left="360"/>
+      </w:pPr>
+      <w:r>
+        <w:rPr>
+          <w:b/>
+          <w:bCs/>
+          <w:i/>
+          <w:iCs/>
+          <w:color w:val="555555"/>
+        </w:rPr>
+        <w:t xml:space="preserve">admin</w:t>
+      </w:r>
+      <w:r>
+        <w:rPr>
+          <w:i/>
+          <w:iCs/>
+          <w:color w:val="555555"/>
+        </w:rPr>
+        <w:t xml:space="preserve"> (see §2.2). Student↔tutor visibility is </w:t>
+      </w:r>
+      <w:r>
+        <w:rPr>
+          <w:b/>
+          <w:bCs/>
+          <w:i/>
+          <w:iCs/>
+          <w:color w:val="555555"/>
+        </w:rPr>
+        <w:t xml:space="preserve">category-derived</w:t>
+      </w:r>
+      <w:r>
+        <w:rPr>
+          <w:i/>
+          <w:iCs/>
+          <w:color w:val="555555"/>
+        </w:rPr>
+        <w:t xml:space="preserve">: a</w:t>
+      </w:r>
+    </w:p>
+    <w:p>
+      <w:pPr>
+        <w:spacing w:after="100"/>
+        <w:ind w:left="360"/>
+      </w:pPr>
+      <w:r>
+        <w:rPr>
+          <w:i/>
+          <w:iCs/>
+          <w:color w:val="555555"/>
+        </w:rPr>
+        <w:t xml:space="preserve">student sees the tutors of the courses in their category, and a tutor sees the</w:t>
+      </w:r>
+    </w:p>
+    <w:p>
+      <w:pPr>
+        <w:spacing w:after="100"/>
+        <w:ind w:left="360"/>
+      </w:pPr>
+      <w:r>
+        <w:rPr>
+          <w:i/>
+          <w:iCs/>
+          <w:color w:val="555555"/>
+        </w:rPr>
+        <w:t xml:space="preserve">students whose category matches their assigned courses.</w:t>
+      </w:r>
     </w:p>
     <w:p>
       <w:pPr>

</xml_diff>

<commit_message>
Admin rosters: live-first fetch from /admin/users with local fallback; doc the backend requirements
- Add dsaApi.admin.listUsers(role); Students/Tutors/Guardians rosters try GET /admin/users?role= first and fall back to the local list with a Live/Local badge.
- Spec §3a: document the two blockers (real admin auth + GET /admin/users?role=) and the exact per-role response fields the frontend consumes.
</commit_message>
<xml_diff>
--- a/docs/DSA-LMS-Backend-Spec.docx
+++ b/docs/DSA-LMS-Backend-Spec.docx
@@ -15617,7 +15617,17 @@
           <w:iCs/>
           <w:color w:val="555555"/>
         </w:rPr>
-        <w:t xml:space="preserve"> The admin dashboard has live lists for</w:t>
+        <w:t xml:space="preserve"> The admin dashboard has </w:t>
+      </w:r>
+      <w:r>
+        <w:rPr>
+          <w:b/>
+          <w:bCs/>
+          <w:i/>
+          <w:iCs/>
+          <w:color w:val="555555"/>
+        </w:rPr>
+        <w:t xml:space="preserve">live-first</w:t>
       </w:r>
     </w:p>
     <w:p>
@@ -15625,6 +15635,14 @@
         <w:spacing w:after="100"/>
         <w:ind w:left="360"/>
       </w:pPr>
+      <w:r>
+        <w:rPr>
+          <w:i/>
+          <w:iCs/>
+          <w:color w:val="555555"/>
+        </w:rPr>
+        <w:t xml:space="preserve">lists for </w:t>
+      </w:r>
       <w:r>
         <w:rPr>
           <w:b/>
@@ -15641,7 +15659,7 @@
           <w:iCs/>
           <w:color w:val="555555"/>
         </w:rPr>
-        <w:t xml:space="preserve"> (and Staff under Permissions). Right now the</w:t>
+        <w:t xml:space="preserve"> (and Staff under Permissions): each</w:t>
       </w:r>
     </w:p>
     <w:p>
@@ -15655,46 +15673,8 @@
           <w:iCs/>
           <w:color w:val="555555"/>
         </w:rPr>
-        <w:t xml:space="preserve">frontend records admin-created </w:t>
-      </w:r>
-      <w:r>
-        <w:rPr>
-          <w:b/>
-          <w:bCs/>
-          <w:i/>
-          <w:iCs/>
-          <w:color w:val="555555"/>
-        </w:rPr>
-        <w:t xml:space="preserve">tutors/guardians locally</w:t>
-      </w:r>
-      <w:r>
-        <w:rPr>
-          <w:i/>
-          <w:iCs/>
-          <w:color w:val="555555"/>
-        </w:rPr>
-        <w:t xml:space="preserve"> (and lists locally</w:t>
-      </w:r>
-    </w:p>
-    <w:p>
-      <w:pPr>
-        <w:spacing w:after="100"/>
-        <w:ind w:left="360"/>
-      </w:pPr>
-      <w:r>
-        <w:rPr>
-          <w:i/>
-          <w:iCs/>
-          <w:color w:val="555555"/>
-        </w:rPr>
-        <w:t xml:space="preserve">registered students) because there is no list endpoint yet — it swaps to</w:t>
-      </w:r>
-    </w:p>
-    <w:p>
-      <w:pPr>
-        <w:spacing w:after="100"/>
-        <w:ind w:left="360"/>
-      </w:pPr>
+        <w:t xml:space="preserve">screen calls </w:t>
+      </w:r>
       <w:r>
         <w:rPr>
           <w:rFonts w:ascii="Consolas" w:cs="Consolas" w:eastAsia="Consolas" w:hAnsi="Consolas"/>
@@ -15710,7 +15690,7 @@
           <w:iCs/>
           <w:color w:val="555555"/>
         </w:rPr>
-        <w:t xml:space="preserve"> the moment it exists. No demo/seed people remain in</w:t>
+        <w:t xml:space="preserve"> first and falls back to a browser-local</w:t>
       </w:r>
     </w:p>
     <w:p>
@@ -15724,7 +15704,7 @@
           <w:iCs/>
           <w:color w:val="555555"/>
         </w:rPr>
-        <w:t xml:space="preserve">the UI: every list is driven by real registrations / admin-created accounts.</w:t>
+        <w:t xml:space="preserve">list until the endpoint exists (a "Live"/"Local" badge shows which). No</w:t>
       </w:r>
     </w:p>
     <w:p>
@@ -15738,64 +15718,732 @@
           <w:iCs/>
           <w:color w:val="555555"/>
         </w:rPr>
-        <w:t xml:space="preserve">Note tutors &amp; guardians are still created via </w:t>
+        <w:t xml:space="preserve">demo/seed people remain — every list is driven by real accounts.</w:t>
+      </w:r>
+    </w:p>
+    <w:p>
+      <w:pPr>
+        <w:pStyle w:val="Heading2"/>
+        <w:spacing w:after="100" w:before="200"/>
+      </w:pPr>
+      <w:r>
+        <w:t xml:space="preserve">3a. REQUIRED to make the admin panel show real users</w:t>
+      </w:r>
+    </w:p>
+    <w:p>
+      <w:pPr>
+        <w:spacing w:after="100"/>
+      </w:pPr>
+      <w:r>
+        <w:t xml:space="preserve">Two backend pieces are </w:t>
+      </w:r>
+      <w:r>
+        <w:rPr>
+          <w:b/>
+          <w:bCs/>
+        </w:rPr>
+        <w:t xml:space="preserve">blocking</w:t>
+      </w:r>
+      <w:r>
+        <w:t xml:space="preserve"> the admin panel from displaying registered</w:t>
+      </w:r>
+    </w:p>
+    <w:p>
+      <w:pPr>
+        <w:spacing w:after="100"/>
+      </w:pPr>
+      <w:r>
+        <w:t xml:space="preserve">users (today </w:t>
       </w:r>
       <w:r>
         <w:rPr>
           <w:rFonts w:ascii="Consolas" w:cs="Consolas" w:eastAsia="Consolas" w:hAnsi="Consolas"/>
-          <w:i/>
-          <w:iCs/>
-          <w:color w:val="555555"/>
+        </w:rPr>
+        <w:t xml:space="preserve">GET /admin/users</w:t>
+      </w:r>
+      <w:r>
+        <w:t xml:space="preserve"> returns </w:t>
+      </w:r>
+      <w:r>
+        <w:rPr>
+          <w:b/>
+          <w:bCs/>
+        </w:rPr>
+        <w:t xml:space="preserve">404</w:t>
+      </w:r>
+      <w:r>
+        <w:t xml:space="preserve"> and admin has no server token):</w:t>
+      </w:r>
+    </w:p>
+    <w:p>
+      <w:pPr>
+        <w:spacing w:after="100"/>
+      </w:pPr>
+      <w:r>
+        <w:rPr>
+          <w:b/>
+          <w:bCs/>
+        </w:rPr>
+        <w:t xml:space="preserve">1. Real admin authentication.</w:t>
+      </w:r>
+      <w:r>
+        <w:t xml:space="preserve"> The admin login is currently a **frontend-only</w:t>
+      </w:r>
+    </w:p>
+    <w:p>
+      <w:pPr>
+        <w:spacing w:after="100"/>
+      </w:pPr>
+      <w:r>
+        <w:t xml:space="preserve">bypass** — there is no server admin session/JWT. Provide a real admin login so</w:t>
+      </w:r>
+    </w:p>
+    <w:p>
+      <w:pPr>
+        <w:spacing w:after="100"/>
+      </w:pPr>
+      <w:r>
+        <w:t xml:space="preserve">the panel sends a valid </w:t>
+      </w:r>
+      <w:r>
+        <w:rPr>
+          <w:rFonts w:ascii="Consolas" w:cs="Consolas" w:eastAsia="Consolas" w:hAnsi="Consolas"/>
+        </w:rPr>
+        <w:t xml:space="preserve">Authorization: Bearer</w:t>
+      </w:r>
+      <w:r>
+        <w:t xml:space="preserve"> token; protected admin endpoints</w:t>
+      </w:r>
+    </w:p>
+    <w:p>
+      <w:pPr>
+        <w:spacing w:after="100"/>
+      </w:pPr>
+      <w:r>
+        <w:t xml:space="preserve">must verify the </w:t>
+      </w:r>
+      <w:r>
+        <w:rPr>
+          <w:rFonts w:ascii="Consolas" w:cs="Consolas" w:eastAsia="Consolas" w:hAnsi="Consolas"/>
+        </w:rPr>
+        <w:t xml:space="preserve">admin</w:t>
+      </w:r>
+      <w:r>
+        <w:t xml:space="preserve">/</w:t>
+      </w:r>
+      <w:r>
+        <w:rPr>
+          <w:rFonts w:ascii="Consolas" w:cs="Consolas" w:eastAsia="Consolas" w:hAnsi="Consolas"/>
+        </w:rPr>
+        <w:t xml:space="preserve">super_admin</w:t>
+      </w:r>
+      <w:r>
+        <w:t xml:space="preserve"> role server-side.</w:t>
+      </w:r>
+    </w:p>
+    <w:p>
+      <w:pPr>
+        <w:spacing w:after="100"/>
+      </w:pPr>
+      <w:r>
+        <w:rPr>
+          <w:b/>
+          <w:bCs/>
+        </w:rPr>
+        <w:t xml:space="preserve">2. `GET /admin/users?role=student|tutor|parent|staff`</w:t>
+      </w:r>
+      <w:r>
+        <w:t xml:space="preserve"> (admin-only). Return</w:t>
+      </w:r>
+    </w:p>
+    <w:p>
+      <w:pPr>
+        <w:spacing w:after="100"/>
+      </w:pPr>
+      <w:r>
+        <w:t xml:space="preserve">the envelope </w:t>
+      </w:r>
+      <w:r>
+        <w:rPr>
+          <w:rFonts w:ascii="Consolas" w:cs="Consolas" w:eastAsia="Consolas" w:hAnsi="Consolas"/>
+        </w:rPr>
+        <w:t xml:space="preserve">{ success, data: User[] }</w:t>
+      </w:r>
+      <w:r>
+        <w:t xml:space="preserve"> (or a bare array). The frontend reads</w:t>
+      </w:r>
+    </w:p>
+    <w:p>
+      <w:pPr>
+        <w:spacing w:after="100"/>
+      </w:pPr>
+      <w:r>
+        <w:t xml:space="preserve">these fields per role (send these names, or the frontend already tolerates the</w:t>
+      </w:r>
+    </w:p>
+    <w:p>
+      <w:pPr>
+        <w:spacing w:after="100"/>
+      </w:pPr>
+      <w:r>
+        <w:t xml:space="preserve">alternates in parentheses):</w:t>
+      </w:r>
+    </w:p>
+    <w:tbl>
+      <w:tblPr>
+        <w:tblW w:type="dxa" w:w="9360"/>
+        <w:tblBorders>
+          <w:top w:val="single" w:color="auto" w:sz="4"/>
+          <w:left w:val="single" w:color="auto" w:sz="4"/>
+          <w:bottom w:val="single" w:color="auto" w:sz="4"/>
+          <w:right w:val="single" w:color="auto" w:sz="4"/>
+          <w:insideH w:val="single" w:color="auto" w:sz="4"/>
+          <w:insideV w:val="single" w:color="auto" w:sz="4"/>
+        </w:tblBorders>
+      </w:tblPr>
+      <w:tblGrid>
+        <w:gridCol w:w="4680"/>
+        <w:gridCol w:w="4680"/>
+      </w:tblGrid>
+      <w:tr>
+        <w:trPr>
+          <w:tblHeader/>
+        </w:trPr>
+        <w:tc>
+          <w:tcPr>
+            <w:tcW w:type="dxa" w:w="4680"/>
+            <w:shd w:fill="E8ECF7" w:val="clear"/>
+            <w:tcMar>
+              <w:top w:type="dxa" w:w="40"/>
+              <w:left w:type="dxa" w:w="80"/>
+              <w:bottom w:type="dxa" w:w="40"/>
+              <w:right w:type="dxa" w:w="80"/>
+            </w:tcMar>
+          </w:tcPr>
+          <w:p>
+            <w:r>
+              <w:rPr>
+                <w:b/>
+                <w:bCs/>
+              </w:rPr>
+              <w:t xml:space="preserve">Role (</w:t>
+            </w:r>
+            <w:r>
+              <w:rPr>
+                <w:rFonts w:ascii="Consolas" w:cs="Consolas" w:eastAsia="Consolas" w:hAnsi="Consolas"/>
+                <w:b/>
+                <w:bCs/>
+              </w:rPr>
+              <w:t xml:space="preserve">?role=</w:t>
+            </w:r>
+            <w:r>
+              <w:rPr>
+                <w:b/>
+                <w:bCs/>
+              </w:rPr>
+              <w:t xml:space="preserve">)</w:t>
+            </w:r>
+          </w:p>
+        </w:tc>
+        <w:tc>
+          <w:tcPr>
+            <w:tcW w:type="dxa" w:w="4680"/>
+            <w:shd w:fill="E8ECF7" w:val="clear"/>
+            <w:tcMar>
+              <w:top w:type="dxa" w:w="40"/>
+              <w:left w:type="dxa" w:w="80"/>
+              <w:bottom w:type="dxa" w:w="40"/>
+              <w:right w:type="dxa" w:w="80"/>
+            </w:tcMar>
+          </w:tcPr>
+          <w:p>
+            <w:r>
+              <w:rPr>
+                <w:b/>
+                <w:bCs/>
+              </w:rPr>
+              <w:t xml:space="preserve">Fields the admin list needs</w:t>
+            </w:r>
+          </w:p>
+        </w:tc>
+      </w:tr>
+      <w:tr>
+        <w:trPr>
+          <w:tblHeader w:val="false"/>
+        </w:trPr>
+        <w:tc>
+          <w:tcPr>
+            <w:tcW w:type="dxa" w:w="4680"/>
+            <w:tcMar>
+              <w:top w:type="dxa" w:w="40"/>
+              <w:left w:type="dxa" w:w="80"/>
+              <w:bottom w:type="dxa" w:w="40"/>
+              <w:right w:type="dxa" w:w="80"/>
+            </w:tcMar>
+          </w:tcPr>
+          <w:p>
+            <w:r>
+              <w:rPr>
+                <w:rFonts w:ascii="Consolas" w:cs="Consolas" w:eastAsia="Consolas" w:hAnsi="Consolas"/>
+              </w:rPr>
+              <w:t xml:space="preserve">student</w:t>
+            </w:r>
+          </w:p>
+        </w:tc>
+        <w:tc>
+          <w:tcPr>
+            <w:tcW w:type="dxa" w:w="4680"/>
+            <w:tcMar>
+              <w:top w:type="dxa" w:w="40"/>
+              <w:left w:type="dxa" w:w="80"/>
+              <w:bottom w:type="dxa" w:w="40"/>
+              <w:right w:type="dxa" w:w="80"/>
+            </w:tcMar>
+          </w:tcPr>
+          <w:p>
+            <w:r>
+              <w:rPr>
+                <w:rFonts w:ascii="Consolas" w:cs="Consolas" w:eastAsia="Consolas" w:hAnsi="Consolas"/>
+              </w:rPr>
+              <w:t xml:space="preserve">id</w:t>
+            </w:r>
+            <w:r>
+              <w:t xml:space="preserve">/</w:t>
+            </w:r>
+            <w:r>
+              <w:rPr>
+                <w:rFonts w:ascii="Consolas" w:cs="Consolas" w:eastAsia="Consolas" w:hAnsi="Consolas"/>
+              </w:rPr>
+              <w:t xml:space="preserve">studentId</w:t>
+            </w:r>
+            <w:r>
+              <w:t xml:space="preserve">, </w:t>
+            </w:r>
+            <w:r>
+              <w:rPr>
+                <w:rFonts w:ascii="Consolas" w:cs="Consolas" w:eastAsia="Consolas" w:hAnsi="Consolas"/>
+              </w:rPr>
+              <w:t xml:space="preserve">fullname</w:t>
+            </w:r>
+            <w:r>
+              <w:t xml:space="preserve"> (or </w:t>
+            </w:r>
+            <w:r>
+              <w:rPr>
+                <w:rFonts w:ascii="Consolas" w:cs="Consolas" w:eastAsia="Consolas" w:hAnsi="Consolas"/>
+              </w:rPr>
+              <w:t xml:space="preserve">fullName</w:t>
+            </w:r>
+            <w:r>
+              <w:t xml:space="preserve">), </w:t>
+            </w:r>
+            <w:r>
+              <w:rPr>
+                <w:rFonts w:ascii="Consolas" w:cs="Consolas" w:eastAsia="Consolas" w:hAnsi="Consolas"/>
+              </w:rPr>
+              <w:t xml:space="preserve">email</w:t>
+            </w:r>
+            <w:r>
+              <w:t xml:space="preserve">, </w:t>
+            </w:r>
+            <w:r>
+              <w:rPr>
+                <w:rFonts w:ascii="Consolas" w:cs="Consolas" w:eastAsia="Consolas" w:hAnsi="Consolas"/>
+              </w:rPr>
+              <w:t xml:space="preserve">examTrack</w:t>
+            </w:r>
+            <w:r>
+              <w:t xml:space="preserve"> (or </w:t>
+            </w:r>
+            <w:r>
+              <w:rPr>
+                <w:rFonts w:ascii="Consolas" w:cs="Consolas" w:eastAsia="Consolas" w:hAnsi="Consolas"/>
+              </w:rPr>
+              <w:t xml:space="preserve">level</w:t>
+            </w:r>
+            <w:r>
+              <w:t xml:space="preserve">), </w:t>
+            </w:r>
+            <w:r>
+              <w:rPr>
+                <w:rFonts w:ascii="Consolas" w:cs="Consolas" w:eastAsia="Consolas" w:hAnsi="Consolas"/>
+              </w:rPr>
+              <w:t xml:space="preserve">learningMode</w:t>
+            </w:r>
+            <w:r>
+              <w:t xml:space="preserve"> (or </w:t>
+            </w:r>
+            <w:r>
+              <w:rPr>
+                <w:rFonts w:ascii="Consolas" w:cs="Consolas" w:eastAsia="Consolas" w:hAnsi="Consolas"/>
+              </w:rPr>
+              <w:t xml:space="preserve">isDsaStudent</w:t>
+            </w:r>
+            <w:r>
+              <w:t xml:space="preserve">)</w:t>
+            </w:r>
+          </w:p>
+        </w:tc>
+      </w:tr>
+      <w:tr>
+        <w:trPr>
+          <w:tblHeader w:val="false"/>
+        </w:trPr>
+        <w:tc>
+          <w:tcPr>
+            <w:tcW w:type="dxa" w:w="4680"/>
+            <w:tcMar>
+              <w:top w:type="dxa" w:w="40"/>
+              <w:left w:type="dxa" w:w="80"/>
+              <w:bottom w:type="dxa" w:w="40"/>
+              <w:right w:type="dxa" w:w="80"/>
+            </w:tcMar>
+          </w:tcPr>
+          <w:p>
+            <w:r>
+              <w:rPr>
+                <w:rFonts w:ascii="Consolas" w:cs="Consolas" w:eastAsia="Consolas" w:hAnsi="Consolas"/>
+              </w:rPr>
+              <w:t xml:space="preserve">tutor</w:t>
+            </w:r>
+          </w:p>
+        </w:tc>
+        <w:tc>
+          <w:tcPr>
+            <w:tcW w:type="dxa" w:w="4680"/>
+            <w:tcMar>
+              <w:top w:type="dxa" w:w="40"/>
+              <w:left w:type="dxa" w:w="80"/>
+              <w:bottom w:type="dxa" w:w="40"/>
+              <w:right w:type="dxa" w:w="80"/>
+            </w:tcMar>
+          </w:tcPr>
+          <w:p>
+            <w:r>
+              <w:rPr>
+                <w:rFonts w:ascii="Consolas" w:cs="Consolas" w:eastAsia="Consolas" w:hAnsi="Consolas"/>
+              </w:rPr>
+              <w:t xml:space="preserve">id</w:t>
+            </w:r>
+            <w:r>
+              <w:t xml:space="preserve">, </w:t>
+            </w:r>
+            <w:r>
+              <w:rPr>
+                <w:rFonts w:ascii="Consolas" w:cs="Consolas" w:eastAsia="Consolas" w:hAnsi="Consolas"/>
+              </w:rPr>
+              <w:t xml:space="preserve">fullname</w:t>
+            </w:r>
+            <w:r>
+              <w:t xml:space="preserve">, </w:t>
+            </w:r>
+            <w:r>
+              <w:rPr>
+                <w:rFonts w:ascii="Consolas" w:cs="Consolas" w:eastAsia="Consolas" w:hAnsi="Consolas"/>
+              </w:rPr>
+              <w:t xml:space="preserve">email</w:t>
+            </w:r>
+            <w:r>
+              <w:t xml:space="preserve">, </w:t>
+            </w:r>
+            <w:r>
+              <w:rPr>
+                <w:rFonts w:ascii="Consolas" w:cs="Consolas" w:eastAsia="Consolas" w:hAnsi="Consolas"/>
+              </w:rPr>
+              <w:t xml:space="preserve">subject</w:t>
+            </w:r>
+            <w:r>
+              <w:t xml:space="preserve"> (or </w:t>
+            </w:r>
+            <w:r>
+              <w:rPr>
+                <w:rFonts w:ascii="Consolas" w:cs="Consolas" w:eastAsia="Consolas" w:hAnsi="Consolas"/>
+              </w:rPr>
+              <w:t xml:space="preserve">subjects[]</w:t>
+            </w:r>
+            <w:r>
+              <w:t xml:space="preserve">)</w:t>
+            </w:r>
+          </w:p>
+        </w:tc>
+      </w:tr>
+      <w:tr>
+        <w:trPr>
+          <w:tblHeader w:val="false"/>
+        </w:trPr>
+        <w:tc>
+          <w:tcPr>
+            <w:tcW w:type="dxa" w:w="4680"/>
+            <w:tcMar>
+              <w:top w:type="dxa" w:w="40"/>
+              <w:left w:type="dxa" w:w="80"/>
+              <w:bottom w:type="dxa" w:w="40"/>
+              <w:right w:type="dxa" w:w="80"/>
+            </w:tcMar>
+          </w:tcPr>
+          <w:p>
+            <w:r>
+              <w:rPr>
+                <w:rFonts w:ascii="Consolas" w:cs="Consolas" w:eastAsia="Consolas" w:hAnsi="Consolas"/>
+              </w:rPr>
+              <w:t xml:space="preserve">parent</w:t>
+            </w:r>
+            <w:r>
+              <w:t xml:space="preserve"> (guardian)</w:t>
+            </w:r>
+          </w:p>
+        </w:tc>
+        <w:tc>
+          <w:tcPr>
+            <w:tcW w:type="dxa" w:w="4680"/>
+            <w:tcMar>
+              <w:top w:type="dxa" w:w="40"/>
+              <w:left w:type="dxa" w:w="80"/>
+              <w:bottom w:type="dxa" w:w="40"/>
+              <w:right w:type="dxa" w:w="80"/>
+            </w:tcMar>
+          </w:tcPr>
+          <w:p>
+            <w:r>
+              <w:rPr>
+                <w:rFonts w:ascii="Consolas" w:cs="Consolas" w:eastAsia="Consolas" w:hAnsi="Consolas"/>
+              </w:rPr>
+              <w:t xml:space="preserve">id</w:t>
+            </w:r>
+            <w:r>
+              <w:t xml:space="preserve">, </w:t>
+            </w:r>
+            <w:r>
+              <w:rPr>
+                <w:rFonts w:ascii="Consolas" w:cs="Consolas" w:eastAsia="Consolas" w:hAnsi="Consolas"/>
+              </w:rPr>
+              <w:t xml:space="preserve">fullname</w:t>
+            </w:r>
+            <w:r>
+              <w:t xml:space="preserve">, </w:t>
+            </w:r>
+            <w:r>
+              <w:rPr>
+                <w:rFonts w:ascii="Consolas" w:cs="Consolas" w:eastAsia="Consolas" w:hAnsi="Consolas"/>
+              </w:rPr>
+              <w:t xml:space="preserve">email</w:t>
+            </w:r>
+            <w:r>
+              <w:t xml:space="preserve">, </w:t>
+            </w:r>
+            <w:r>
+              <w:rPr>
+                <w:rFonts w:ascii="Consolas" w:cs="Consolas" w:eastAsia="Consolas" w:hAnsi="Consolas"/>
+              </w:rPr>
+              <w:t xml:space="preserve">wardName</w:t>
+            </w:r>
+            <w:r>
+              <w:t xml:space="preserve"> (the linked student's name)</w:t>
+            </w:r>
+          </w:p>
+        </w:tc>
+      </w:tr>
+      <w:tr>
+        <w:trPr>
+          <w:tblHeader w:val="false"/>
+        </w:trPr>
+        <w:tc>
+          <w:tcPr>
+            <w:tcW w:type="dxa" w:w="4680"/>
+            <w:tcMar>
+              <w:top w:type="dxa" w:w="40"/>
+              <w:left w:type="dxa" w:w="80"/>
+              <w:bottom w:type="dxa" w:w="40"/>
+              <w:right w:type="dxa" w:w="80"/>
+            </w:tcMar>
+          </w:tcPr>
+          <w:p>
+            <w:r>
+              <w:rPr>
+                <w:rFonts w:ascii="Consolas" w:cs="Consolas" w:eastAsia="Consolas" w:hAnsi="Consolas"/>
+              </w:rPr>
+              <w:t xml:space="preserve">staff</w:t>
+            </w:r>
+          </w:p>
+        </w:tc>
+        <w:tc>
+          <w:tcPr>
+            <w:tcW w:type="dxa" w:w="4680"/>
+            <w:tcMar>
+              <w:top w:type="dxa" w:w="40"/>
+              <w:left w:type="dxa" w:w="80"/>
+              <w:bottom w:type="dxa" w:w="40"/>
+              <w:right w:type="dxa" w:w="80"/>
+            </w:tcMar>
+          </w:tcPr>
+          <w:p>
+            <w:r>
+              <w:rPr>
+                <w:rFonts w:ascii="Consolas" w:cs="Consolas" w:eastAsia="Consolas" w:hAnsi="Consolas"/>
+              </w:rPr>
+              <w:t xml:space="preserve">id</w:t>
+            </w:r>
+            <w:r>
+              <w:t xml:space="preserve">, </w:t>
+            </w:r>
+            <w:r>
+              <w:rPr>
+                <w:rFonts w:ascii="Consolas" w:cs="Consolas" w:eastAsia="Consolas" w:hAnsi="Consolas"/>
+              </w:rPr>
+              <w:t xml:space="preserve">fullname</w:t>
+            </w:r>
+            <w:r>
+              <w:t xml:space="preserve">, </w:t>
+            </w:r>
+            <w:r>
+              <w:rPr>
+                <w:rFonts w:ascii="Consolas" w:cs="Consolas" w:eastAsia="Consolas" w:hAnsi="Consolas"/>
+              </w:rPr>
+              <w:t xml:space="preserve">email</w:t>
+            </w:r>
+            <w:r>
+              <w:t xml:space="preserve">, </w:t>
+            </w:r>
+            <w:r>
+              <w:rPr>
+                <w:rFonts w:ascii="Consolas" w:cs="Consolas" w:eastAsia="Consolas" w:hAnsi="Consolas"/>
+              </w:rPr>
+              <w:t xml:space="preserve">role</w:t>
+            </w:r>
+            <w:r>
+              <w:t xml:space="preserve">/</w:t>
+            </w:r>
+            <w:r>
+              <w:rPr>
+                <w:rFonts w:ascii="Consolas" w:cs="Consolas" w:eastAsia="Consolas" w:hAnsi="Consolas"/>
+              </w:rPr>
+              <w:t xml:space="preserve">staffRole</w:t>
+            </w:r>
+            <w:r>
+              <w:t xml:space="preserve"> + </w:t>
+            </w:r>
+            <w:r>
+              <w:rPr>
+                <w:rFonts w:ascii="Consolas" w:cs="Consolas" w:eastAsia="Consolas" w:hAnsi="Consolas"/>
+              </w:rPr>
+              <w:t xml:space="preserve">permissions[]</w:t>
+            </w:r>
+          </w:p>
+        </w:tc>
+      </w:tr>
+    </w:tbl>
+    <w:p>
+      <w:pPr>
+        <w:spacing w:after="80"/>
+      </w:pPr>
+    </w:p>
+    <w:p>
+      <w:pPr>
+        <w:spacing w:after="100"/>
+      </w:pPr>
+      <w:r>
+        <w:t xml:space="preserve">Support </w:t>
+      </w:r>
+      <w:r>
+        <w:rPr>
+          <w:rFonts w:ascii="Consolas" w:cs="Consolas" w:eastAsia="Consolas" w:hAnsi="Consolas"/>
+        </w:rPr>
+        <w:t xml:space="preserve">?search=</w:t>
+      </w:r>
+      <w:r>
+        <w:t xml:space="preserve"> and pagination (</w:t>
+      </w:r>
+      <w:r>
+        <w:rPr>
+          <w:rFonts w:ascii="Consolas" w:cs="Consolas" w:eastAsia="Consolas" w:hAnsi="Consolas"/>
+        </w:rPr>
+        <w:t xml:space="preserve">?page=&amp;limit=</w:t>
+      </w:r>
+      <w:r>
+        <w:t xml:space="preserve">). Once both ship, the admin's</w:t>
+      </w:r>
+    </w:p>
+    <w:p>
+      <w:pPr>
+        <w:spacing w:after="100"/>
+      </w:pPr>
+      <w:r>
+        <w:t xml:space="preserve">Students/Tutors/Guardians lists populate from the database automatically — no</w:t>
+      </w:r>
+    </w:p>
+    <w:p>
+      <w:pPr>
+        <w:spacing w:after="100"/>
+      </w:pPr>
+      <w:r>
+        <w:t xml:space="preserve">frontend change needed.</w:t>
+      </w:r>
+    </w:p>
+    <w:p>
+      <w:pPr>
+        <w:spacing w:after="100"/>
+      </w:pPr>
+      <w:r>
+        <w:t xml:space="preserve">Related: tutors &amp; guardians are still </w:t>
+      </w:r>
+      <w:r>
+        <w:rPr>
+          <w:b/>
+          <w:bCs/>
+        </w:rPr>
+        <w:t xml:space="preserve">created</w:t>
+      </w:r>
+      <w:r>
+        <w:t xml:space="preserve"> via </w:t>
+      </w:r>
+      <w:r>
+        <w:rPr>
+          <w:rFonts w:ascii="Consolas" w:cs="Consolas" w:eastAsia="Consolas" w:hAnsi="Consolas"/>
         </w:rPr>
         <w:t xml:space="preserve">/auth/register</w:t>
       </w:r>
       <w:r>
-        <w:rPr>
-          <w:i/>
-          <w:iCs/>
-          <w:color w:val="555555"/>
-        </w:rPr>
-        <w:t xml:space="preserve"> (role </w:t>
-      </w:r>
+        <w:t xml:space="preserve"> (role</w:t>
+      </w:r>
+    </w:p>
+    <w:p>
+      <w:pPr>
+        <w:spacing w:after="100"/>
+      </w:pPr>
       <w:r>
         <w:rPr>
           <w:rFonts w:ascii="Consolas" w:cs="Consolas" w:eastAsia="Consolas" w:hAnsi="Consolas"/>
-          <w:i/>
-          <w:iCs/>
-          <w:color w:val="555555"/>
         </w:rPr>
         <w:t xml:space="preserve">tutor</w:t>
       </w:r>
       <w:r>
+        <w:t xml:space="preserve"> / </w:t>
+      </w:r>
+      <w:r>
         <w:rPr>
-          <w:i/>
-          <w:iCs/>
-          <w:color w:val="555555"/>
+          <w:rFonts w:ascii="Consolas" w:cs="Consolas" w:eastAsia="Consolas" w:hAnsi="Consolas"/>
         </w:rPr>
-        <w:t xml:space="preserve"> /</w:t>
+        <w:t xml:space="preserve">parent</w:t>
+      </w:r>
+      <w:r>
+        <w:t xml:space="preserve">); a dedicated </w:t>
+      </w:r>
+      <w:r>
+        <w:rPr>
+          <w:rFonts w:ascii="Consolas" w:cs="Consolas" w:eastAsia="Consolas" w:hAnsi="Consolas"/>
+        </w:rPr>
+        <w:t xml:space="preserve">POST /admin/staff</w:t>
+      </w:r>
+      <w:r>
+        <w:t xml:space="preserve">-style admin-create endpoint</w:t>
       </w:r>
     </w:p>
     <w:p>
       <w:pPr>
         <w:spacing w:after="100"/>
-        <w:ind w:left="360"/>
-      </w:pPr>
-      <w:r>
-        <w:rPr>
-          <w:rFonts w:ascii="Consolas" w:cs="Consolas" w:eastAsia="Consolas" w:hAnsi="Consolas"/>
-          <w:i/>
-          <w:iCs/>
-          <w:color w:val="555555"/>
-        </w:rPr>
-        <w:t xml:space="preserve">parent</w:t>
-      </w:r>
-      <w:r>
-        <w:rPr>
-          <w:i/>
-          <w:iCs/>
-          <w:color w:val="555555"/>
-        </w:rPr>
-        <w:t xml:space="preserve">); a dedicated admin-create endpoint is requested above.</w:t>
+      </w:pPr>
+      <w:r>
+        <w:t xml:space="preserve">is requested above.</w:t>
       </w:r>
     </w:p>
     <w:p>

</xml_diff>